<commit_message>
auctions: rework layout — map framing, denser photo sheets, one type scale
Map: no red ring, and the zoom is now derived from the geocoded nearest
metro so the station is always in frame. Photo sheets give rows exact
heights that fill the page, and the first photos ride along under the map.
Page one is put on a single five-step type scale with one accent colour.
</commit_message>
<xml_diff>
--- a/auctions/out/Торги_Москва_и_Подмосковье.docx
+++ b/auctions/out/Торги_Москва_и_Подмосковье.docx
@@ -13,41 +13,10 @@
           <w:bCs/>
           <w:color w:val="1F3864"/>
           <w:spacing w:val="40"/>
-          <w:sz w:val="44"/>
-          <w:szCs w:val="44"/>
+          <w:sz w:val="40"/>
+          <w:szCs w:val="40"/>
         </w:rPr>
         <w:t xml:space="preserve">ОБЪЕКТЫ ТОРГОВ</w:t>
-      </w:r>
-    </w:p>
-    <w:p>
-      <w:pPr>
-        <w:spacing w:after="40"/>
-      </w:pPr>
-      <w:r>
-        <w:rPr>
-          <w:rFonts w:ascii="Arial" w:cs="Arial" w:eastAsia="Arial" w:hAnsi="Arial"/>
-          <w:color w:val="C00000"/>
-          <w:sz w:val="28"/>
-          <w:szCs w:val="28"/>
-        </w:rPr>
-        <w:t xml:space="preserve">Москва и Подмосковье</w:t>
-      </w:r>
-    </w:p>
-    <w:p>
-      <w:pPr>
-        <w:pBdr>
-          <w:bottom w:val="single" w:color="1F3864" w:sz="12"/>
-        </w:pBdr>
-        <w:spacing w:after="240"/>
-      </w:pPr>
-      <w:r>
-        <w:rPr>
-          <w:rFonts w:ascii="Arial" w:cs="Arial" w:eastAsia="Arial" w:hAnsi="Arial"/>
-          <w:color w:val="595959"/>
-          <w:sz w:val="20"/>
-          <w:szCs w:val="20"/>
-        </w:rPr>
-        <w:t xml:space="preserve">Выпуск от 31.08.2026 · объектов в подборке: 1</w:t>
       </w:r>
     </w:p>
     <w:p>
@@ -57,20 +26,50 @@
       <w:r>
         <w:rPr>
           <w:rFonts w:ascii="Arial" w:cs="Arial" w:eastAsia="Arial" w:hAnsi="Arial"/>
+          <w:color w:val="767676"/>
+          <w:sz w:val="22"/>
+          <w:szCs w:val="22"/>
+        </w:rPr>
+        <w:t xml:space="preserve">Москва и Подмосковье</w:t>
+      </w:r>
+    </w:p>
+    <w:p>
+      <w:pPr>
+        <w:pBdr>
+          <w:bottom w:val="single" w:color="1F3864" w:sz="10"/>
+        </w:pBdr>
+        <w:spacing w:after="120"/>
+      </w:pPr>
+      <w:r>
+        <w:rPr>
+          <w:rFonts w:ascii="Arial" w:cs="Arial" w:eastAsia="Arial" w:hAnsi="Arial"/>
+          <w:color w:val="767676"/>
+          <w:sz w:val="17"/>
+          <w:szCs w:val="17"/>
+        </w:rPr>
+        <w:t xml:space="preserve">Выпуск от 31.08.2026 · объектов в подборке: 1</w:t>
+      </w:r>
+    </w:p>
+    <w:p>
+      <w:pPr>
+        <w:spacing w:after="60" w:before="240"/>
+      </w:pPr>
+      <w:r>
+        <w:rPr>
+          <w:rFonts w:ascii="Arial" w:cs="Arial" w:eastAsia="Arial" w:hAnsi="Arial"/>
           <w:b/>
           <w:bCs/>
-          <w:color w:val="C00000"/>
+          <w:color w:val="767676"/>
           <w:spacing w:val="40"/>
-          <w:sz w:val="20"/>
-          <w:szCs w:val="20"/>
+          <w:sz w:val="17"/>
+          <w:szCs w:val="17"/>
         </w:rPr>
         <w:t xml:space="preserve">ОБЪЕКТ 1</w:t>
       </w:r>
     </w:p>
     <w:p>
       <w:pPr>
-        <w:pStyle w:val="Heading1"/>
-        <w:spacing w:after="260" w:before="0"/>
+        <w:spacing w:after="240"/>
       </w:pPr>
       <w:r>
         <w:rPr>
@@ -78,8 +77,8 @@
           <w:b/>
           <w:bCs/>
           <w:color w:val="1F3864"/>
-          <w:sz w:val="28"/>
-          <w:szCs w:val="28"/>
+          <w:sz w:val="26"/>
+          <w:szCs w:val="26"/>
         </w:rPr>
         <w:t xml:space="preserve">3-комн. квартира, 96 м² — Колокольников пер., 15</w:t>
       </w:r>
@@ -105,17 +104,17 @@
           <w:tcPr>
             <w:tcW w:type="dxa" w:w="3100"/>
             <w:tcBorders>
-              <w:top w:val="single" w:color="BFBFBF" w:sz="4"/>
-              <w:left w:val="single" w:color="BFBFBF" w:sz="4"/>
-              <w:bottom w:val="single" w:color="BFBFBF" w:sz="4"/>
-              <w:right w:val="single" w:color="BFBFBF" w:sz="4"/>
-            </w:tcBorders>
-            <w:shd w:fill="F2F5FA" w:color="auto" w:val="clear"/>
-            <w:tcMar>
-              <w:top w:type="dxa" w:w="90"/>
-              <w:left w:type="dxa" w:w="140"/>
-              <w:bottom w:type="dxa" w:w="90"/>
-              <w:right w:type="dxa" w:w="140"/>
+              <w:top w:val="single" w:color="D0D7E5" w:sz="4"/>
+              <w:left w:val="single" w:color="D0D7E5" w:sz="4"/>
+              <w:bottom w:val="single" w:color="D0D7E5" w:sz="4"/>
+              <w:right w:val="single" w:color="D0D7E5" w:sz="4"/>
+            </w:tcBorders>
+            <w:shd w:fill="F4F6FA" w:color="auto" w:val="clear"/>
+            <w:tcMar>
+              <w:top w:type="dxa" w:w="165"/>
+              <w:left w:type="dxa" w:w="150"/>
+              <w:bottom w:type="dxa" w:w="165"/>
+              <w:right w:type="dxa" w:w="150"/>
             </w:tcMar>
             <w:vAlign w:val="center"/>
           </w:tcPr>
@@ -126,8 +125,8 @@
                 <w:b/>
                 <w:bCs/>
                 <w:color w:val="1F3864"/>
-                <w:sz w:val="20"/>
-                <w:szCs w:val="20"/>
+                <w:sz w:val="19"/>
+                <w:szCs w:val="19"/>
               </w:rPr>
               <w:t xml:space="preserve">Описание объекта</w:t>
             </w:r>
@@ -137,16 +136,16 @@
           <w:tcPr>
             <w:tcW w:type="dxa" w:w="6538"/>
             <w:tcBorders>
-              <w:top w:val="single" w:color="BFBFBF" w:sz="4"/>
-              <w:left w:val="single" w:color="BFBFBF" w:sz="4"/>
-              <w:bottom w:val="single" w:color="BFBFBF" w:sz="4"/>
-              <w:right w:val="single" w:color="BFBFBF" w:sz="4"/>
-            </w:tcBorders>
-            <w:tcMar>
-              <w:top w:type="dxa" w:w="90"/>
-              <w:left w:type="dxa" w:w="140"/>
-              <w:bottom w:type="dxa" w:w="90"/>
-              <w:right w:type="dxa" w:w="140"/>
+              <w:top w:val="single" w:color="D0D7E5" w:sz="4"/>
+              <w:left w:val="single" w:color="D0D7E5" w:sz="4"/>
+              <w:bottom w:val="single" w:color="D0D7E5" w:sz="4"/>
+              <w:right w:val="single" w:color="D0D7E5" w:sz="4"/>
+            </w:tcBorders>
+            <w:tcMar>
+              <w:top w:type="dxa" w:w="165"/>
+              <w:left w:type="dxa" w:w="150"/>
+              <w:bottom w:type="dxa" w:w="165"/>
+              <w:right w:type="dxa" w:w="150"/>
             </w:tcMar>
             <w:vAlign w:val="center"/>
           </w:tcPr>
@@ -156,9 +155,9 @@
                 <w:rFonts w:ascii="Arial" w:cs="Arial" w:eastAsia="Arial" w:hAnsi="Arial"/>
                 <w:b w:val="false"/>
                 <w:bCs w:val="false"/>
-                <w:color w:val="000000"/>
-                <w:sz w:val="21"/>
-                <w:szCs w:val="21"/>
+                <w:color w:val="1A1A1A"/>
+                <w:sz w:val="19"/>
+                <w:szCs w:val="19"/>
               </w:rPr>
               <w:t xml:space="preserve">Трёхкомнатная квартира 96 м² в историческом доходном доме 1917 года постройки в самом центре Москвы (ЦАО, Мещанский район), 7 минут пешком до метро «Трубная». Второй этаж трёхэтажного дома, высокие потолки 2,68 м, кухня 13 м². Обременений нет.</w:t>
             </w:r>
@@ -170,17 +169,17 @@
           <w:tcPr>
             <w:tcW w:type="dxa" w:w="3100"/>
             <w:tcBorders>
-              <w:top w:val="single" w:color="BFBFBF" w:sz="4"/>
-              <w:left w:val="single" w:color="BFBFBF" w:sz="4"/>
-              <w:bottom w:val="single" w:color="BFBFBF" w:sz="4"/>
-              <w:right w:val="single" w:color="BFBFBF" w:sz="4"/>
-            </w:tcBorders>
-            <w:shd w:fill="F2F5FA" w:color="auto" w:val="clear"/>
-            <w:tcMar>
-              <w:top w:type="dxa" w:w="90"/>
-              <w:left w:type="dxa" w:w="140"/>
-              <w:bottom w:type="dxa" w:w="90"/>
-              <w:right w:type="dxa" w:w="140"/>
+              <w:top w:val="single" w:color="D0D7E5" w:sz="4"/>
+              <w:left w:val="single" w:color="D0D7E5" w:sz="4"/>
+              <w:bottom w:val="single" w:color="D0D7E5" w:sz="4"/>
+              <w:right w:val="single" w:color="D0D7E5" w:sz="4"/>
+            </w:tcBorders>
+            <w:shd w:fill="F4F6FA" w:color="auto" w:val="clear"/>
+            <w:tcMar>
+              <w:top w:type="dxa" w:w="165"/>
+              <w:left w:type="dxa" w:w="150"/>
+              <w:bottom w:type="dxa" w:w="165"/>
+              <w:right w:type="dxa" w:w="150"/>
             </w:tcMar>
             <w:vAlign w:val="center"/>
           </w:tcPr>
@@ -191,8 +190,8 @@
                 <w:b/>
                 <w:bCs/>
                 <w:color w:val="1F3864"/>
-                <w:sz w:val="20"/>
-                <w:szCs w:val="20"/>
+                <w:sz w:val="19"/>
+                <w:szCs w:val="19"/>
               </w:rPr>
               <w:t xml:space="preserve">Точный адрес</w:t>
             </w:r>
@@ -202,16 +201,16 @@
           <w:tcPr>
             <w:tcW w:type="dxa" w:w="6538"/>
             <w:tcBorders>
-              <w:top w:val="single" w:color="BFBFBF" w:sz="4"/>
-              <w:left w:val="single" w:color="BFBFBF" w:sz="4"/>
-              <w:bottom w:val="single" w:color="BFBFBF" w:sz="4"/>
-              <w:right w:val="single" w:color="BFBFBF" w:sz="4"/>
-            </w:tcBorders>
-            <w:tcMar>
-              <w:top w:type="dxa" w:w="90"/>
-              <w:left w:type="dxa" w:w="140"/>
-              <w:bottom w:type="dxa" w:w="90"/>
-              <w:right w:type="dxa" w:w="140"/>
+              <w:top w:val="single" w:color="D0D7E5" w:sz="4"/>
+              <w:left w:val="single" w:color="D0D7E5" w:sz="4"/>
+              <w:bottom w:val="single" w:color="D0D7E5" w:sz="4"/>
+              <w:right w:val="single" w:color="D0D7E5" w:sz="4"/>
+            </w:tcBorders>
+            <w:tcMar>
+              <w:top w:type="dxa" w:w="165"/>
+              <w:left w:type="dxa" w:w="150"/>
+              <w:bottom w:type="dxa" w:w="165"/>
+              <w:right w:type="dxa" w:w="150"/>
             </w:tcMar>
             <w:vAlign w:val="center"/>
           </w:tcPr>
@@ -221,9 +220,9 @@
                 <w:rFonts w:ascii="Arial" w:cs="Arial" w:eastAsia="Arial" w:hAnsi="Arial"/>
                 <w:b w:val="false"/>
                 <w:bCs w:val="false"/>
-                <w:color w:val="000000"/>
-                <w:sz w:val="21"/>
-                <w:szCs w:val="21"/>
+                <w:color w:val="1A1A1A"/>
+                <w:sz w:val="19"/>
+                <w:szCs w:val="19"/>
               </w:rPr>
               <w:t xml:space="preserve">г. Москва, ЦАО, Мещанский район, Колокольников переулок, д. 15, этаж 2, квартира 13</w:t>
             </w:r>
@@ -235,17 +234,17 @@
           <w:tcPr>
             <w:tcW w:type="dxa" w:w="3100"/>
             <w:tcBorders>
-              <w:top w:val="single" w:color="BFBFBF" w:sz="4"/>
-              <w:left w:val="single" w:color="BFBFBF" w:sz="4"/>
-              <w:bottom w:val="single" w:color="BFBFBF" w:sz="4"/>
-              <w:right w:val="single" w:color="BFBFBF" w:sz="4"/>
-            </w:tcBorders>
-            <w:shd w:fill="F2F5FA" w:color="auto" w:val="clear"/>
-            <w:tcMar>
-              <w:top w:type="dxa" w:w="90"/>
-              <w:left w:type="dxa" w:w="140"/>
-              <w:bottom w:type="dxa" w:w="90"/>
-              <w:right w:type="dxa" w:w="140"/>
+              <w:top w:val="single" w:color="D0D7E5" w:sz="4"/>
+              <w:left w:val="single" w:color="D0D7E5" w:sz="4"/>
+              <w:bottom w:val="single" w:color="D0D7E5" w:sz="4"/>
+              <w:right w:val="single" w:color="D0D7E5" w:sz="4"/>
+            </w:tcBorders>
+            <w:shd w:fill="F4F6FA" w:color="auto" w:val="clear"/>
+            <w:tcMar>
+              <w:top w:type="dxa" w:w="165"/>
+              <w:left w:type="dxa" w:w="150"/>
+              <w:bottom w:type="dxa" w:w="165"/>
+              <w:right w:type="dxa" w:w="150"/>
             </w:tcMar>
             <w:vAlign w:val="center"/>
           </w:tcPr>
@@ -256,8 +255,8 @@
                 <w:b/>
                 <w:bCs/>
                 <w:color w:val="1F3864"/>
-                <w:sz w:val="20"/>
-                <w:szCs w:val="20"/>
+                <w:sz w:val="19"/>
+                <w:szCs w:val="19"/>
               </w:rPr>
               <w:t xml:space="preserve">Начальная цена</w:t>
             </w:r>
@@ -267,16 +266,16 @@
           <w:tcPr>
             <w:tcW w:type="dxa" w:w="6538"/>
             <w:tcBorders>
-              <w:top w:val="single" w:color="BFBFBF" w:sz="4"/>
-              <w:left w:val="single" w:color="BFBFBF" w:sz="4"/>
-              <w:bottom w:val="single" w:color="BFBFBF" w:sz="4"/>
-              <w:right w:val="single" w:color="BFBFBF" w:sz="4"/>
-            </w:tcBorders>
-            <w:tcMar>
-              <w:top w:type="dxa" w:w="90"/>
-              <w:left w:type="dxa" w:w="140"/>
-              <w:bottom w:type="dxa" w:w="90"/>
-              <w:right w:type="dxa" w:w="140"/>
+              <w:top w:val="single" w:color="D0D7E5" w:sz="4"/>
+              <w:left w:val="single" w:color="D0D7E5" w:sz="4"/>
+              <w:bottom w:val="single" w:color="D0D7E5" w:sz="4"/>
+              <w:right w:val="single" w:color="D0D7E5" w:sz="4"/>
+            </w:tcBorders>
+            <w:tcMar>
+              <w:top w:type="dxa" w:w="165"/>
+              <w:left w:type="dxa" w:w="150"/>
+              <w:bottom w:type="dxa" w:w="165"/>
+              <w:right w:type="dxa" w:w="150"/>
             </w:tcMar>
             <w:vAlign w:val="center"/>
           </w:tcPr>
@@ -286,9 +285,9 @@
                 <w:rFonts w:ascii="Arial" w:cs="Arial" w:eastAsia="Arial" w:hAnsi="Arial"/>
                 <w:b/>
                 <w:bCs/>
-                <w:color w:val="C00000"/>
-                <w:sz w:val="26"/>
-                <w:szCs w:val="26"/>
+                <w:color w:val="A3161B"/>
+                <w:sz w:val="22"/>
+                <w:szCs w:val="22"/>
               </w:rPr>
               <w:t xml:space="preserve">52 393 000,00 руб.</w:t>
             </w:r>
@@ -300,17 +299,17 @@
           <w:tcPr>
             <w:tcW w:type="dxa" w:w="3100"/>
             <w:tcBorders>
-              <w:top w:val="single" w:color="BFBFBF" w:sz="4"/>
-              <w:left w:val="single" w:color="BFBFBF" w:sz="4"/>
-              <w:bottom w:val="single" w:color="BFBFBF" w:sz="4"/>
-              <w:right w:val="single" w:color="BFBFBF" w:sz="4"/>
-            </w:tcBorders>
-            <w:shd w:fill="F2F5FA" w:color="auto" w:val="clear"/>
-            <w:tcMar>
-              <w:top w:type="dxa" w:w="90"/>
-              <w:left w:type="dxa" w:w="140"/>
-              <w:bottom w:type="dxa" w:w="90"/>
-              <w:right w:type="dxa" w:w="140"/>
+              <w:top w:val="single" w:color="D0D7E5" w:sz="4"/>
+              <w:left w:val="single" w:color="D0D7E5" w:sz="4"/>
+              <w:bottom w:val="single" w:color="D0D7E5" w:sz="4"/>
+              <w:right w:val="single" w:color="D0D7E5" w:sz="4"/>
+            </w:tcBorders>
+            <w:shd w:fill="F4F6FA" w:color="auto" w:val="clear"/>
+            <w:tcMar>
+              <w:top w:type="dxa" w:w="165"/>
+              <w:left w:type="dxa" w:w="150"/>
+              <w:bottom w:type="dxa" w:w="165"/>
+              <w:right w:type="dxa" w:w="150"/>
             </w:tcMar>
             <w:vAlign w:val="center"/>
           </w:tcPr>
@@ -321,8 +320,8 @@
                 <w:b/>
                 <w:bCs/>
                 <w:color w:val="1F3864"/>
-                <w:sz w:val="20"/>
-                <w:szCs w:val="20"/>
+                <w:sz w:val="19"/>
+                <w:szCs w:val="19"/>
               </w:rPr>
               <w:t xml:space="preserve">Цена за кв. м.</w:t>
             </w:r>
@@ -332,16 +331,16 @@
           <w:tcPr>
             <w:tcW w:type="dxa" w:w="6538"/>
             <w:tcBorders>
-              <w:top w:val="single" w:color="BFBFBF" w:sz="4"/>
-              <w:left w:val="single" w:color="BFBFBF" w:sz="4"/>
-              <w:bottom w:val="single" w:color="BFBFBF" w:sz="4"/>
-              <w:right w:val="single" w:color="BFBFBF" w:sz="4"/>
-            </w:tcBorders>
-            <w:tcMar>
-              <w:top w:type="dxa" w:w="90"/>
-              <w:left w:type="dxa" w:w="140"/>
-              <w:bottom w:type="dxa" w:w="90"/>
-              <w:right w:type="dxa" w:w="140"/>
+              <w:top w:val="single" w:color="D0D7E5" w:sz="4"/>
+              <w:left w:val="single" w:color="D0D7E5" w:sz="4"/>
+              <w:bottom w:val="single" w:color="D0D7E5" w:sz="4"/>
+              <w:right w:val="single" w:color="D0D7E5" w:sz="4"/>
+            </w:tcBorders>
+            <w:tcMar>
+              <w:top w:type="dxa" w:w="165"/>
+              <w:left w:type="dxa" w:w="150"/>
+              <w:bottom w:type="dxa" w:w="165"/>
+              <w:right w:type="dxa" w:w="150"/>
             </w:tcMar>
             <w:vAlign w:val="center"/>
           </w:tcPr>
@@ -351,9 +350,9 @@
                 <w:rFonts w:ascii="Arial" w:cs="Arial" w:eastAsia="Arial" w:hAnsi="Arial"/>
                 <w:b w:val="false"/>
                 <w:bCs w:val="false"/>
-                <w:color w:val="000000"/>
-                <w:sz w:val="21"/>
-                <w:szCs w:val="21"/>
+                <w:color w:val="1A1A1A"/>
+                <w:sz w:val="19"/>
+                <w:szCs w:val="19"/>
               </w:rPr>
               <w:t xml:space="preserve">545 760,42 руб. за м²</w:t>
             </w:r>
@@ -365,17 +364,17 @@
           <w:tcPr>
             <w:tcW w:type="dxa" w:w="3100"/>
             <w:tcBorders>
-              <w:top w:val="single" w:color="BFBFBF" w:sz="4"/>
-              <w:left w:val="single" w:color="BFBFBF" w:sz="4"/>
-              <w:bottom w:val="single" w:color="BFBFBF" w:sz="4"/>
-              <w:right w:val="single" w:color="BFBFBF" w:sz="4"/>
-            </w:tcBorders>
-            <w:shd w:fill="F2F5FA" w:color="auto" w:val="clear"/>
-            <w:tcMar>
-              <w:top w:type="dxa" w:w="90"/>
-              <w:left w:type="dxa" w:w="140"/>
-              <w:bottom w:type="dxa" w:w="90"/>
-              <w:right w:type="dxa" w:w="140"/>
+              <w:top w:val="single" w:color="D0D7E5" w:sz="4"/>
+              <w:left w:val="single" w:color="D0D7E5" w:sz="4"/>
+              <w:bottom w:val="single" w:color="D0D7E5" w:sz="4"/>
+              <w:right w:val="single" w:color="D0D7E5" w:sz="4"/>
+            </w:tcBorders>
+            <w:shd w:fill="F4F6FA" w:color="auto" w:val="clear"/>
+            <w:tcMar>
+              <w:top w:type="dxa" w:w="165"/>
+              <w:left w:type="dxa" w:w="150"/>
+              <w:bottom w:type="dxa" w:w="165"/>
+              <w:right w:type="dxa" w:w="150"/>
             </w:tcMar>
             <w:vAlign w:val="center"/>
           </w:tcPr>
@@ -386,8 +385,8 @@
                 <w:b/>
                 <w:bCs/>
                 <w:color w:val="1F3864"/>
-                <w:sz w:val="20"/>
-                <w:szCs w:val="20"/>
+                <w:sz w:val="19"/>
+                <w:szCs w:val="19"/>
               </w:rPr>
               <w:t xml:space="preserve">Дата окончания приёма заявок</w:t>
             </w:r>
@@ -397,16 +396,16 @@
           <w:tcPr>
             <w:tcW w:type="dxa" w:w="6538"/>
             <w:tcBorders>
-              <w:top w:val="single" w:color="BFBFBF" w:sz="4"/>
-              <w:left w:val="single" w:color="BFBFBF" w:sz="4"/>
-              <w:bottom w:val="single" w:color="BFBFBF" w:sz="4"/>
-              <w:right w:val="single" w:color="BFBFBF" w:sz="4"/>
-            </w:tcBorders>
-            <w:tcMar>
-              <w:top w:type="dxa" w:w="90"/>
-              <w:left w:type="dxa" w:w="140"/>
-              <w:bottom w:type="dxa" w:w="90"/>
-              <w:right w:type="dxa" w:w="140"/>
+              <w:top w:val="single" w:color="D0D7E5" w:sz="4"/>
+              <w:left w:val="single" w:color="D0D7E5" w:sz="4"/>
+              <w:bottom w:val="single" w:color="D0D7E5" w:sz="4"/>
+              <w:right w:val="single" w:color="D0D7E5" w:sz="4"/>
+            </w:tcBorders>
+            <w:tcMar>
+              <w:top w:type="dxa" w:w="165"/>
+              <w:left w:type="dxa" w:w="150"/>
+              <w:bottom w:type="dxa" w:w="165"/>
+              <w:right w:type="dxa" w:w="150"/>
             </w:tcMar>
             <w:vAlign w:val="center"/>
           </w:tcPr>
@@ -416,9 +415,9 @@
                 <w:rFonts w:ascii="Arial" w:cs="Arial" w:eastAsia="Arial" w:hAnsi="Arial"/>
                 <w:b w:val="false"/>
                 <w:bCs w:val="false"/>
-                <w:color w:val="000000"/>
-                <w:sz w:val="21"/>
-                <w:szCs w:val="21"/>
+                <w:color w:val="1A1A1A"/>
+                <w:sz w:val="19"/>
+                <w:szCs w:val="19"/>
               </w:rPr>
               <w:t xml:space="preserve">20.10.2026, 15:00 (МСК)</w:t>
             </w:r>
@@ -430,17 +429,17 @@
           <w:tcPr>
             <w:tcW w:type="dxa" w:w="3100"/>
             <w:tcBorders>
-              <w:top w:val="single" w:color="BFBFBF" w:sz="4"/>
-              <w:left w:val="single" w:color="BFBFBF" w:sz="4"/>
-              <w:bottom w:val="single" w:color="BFBFBF" w:sz="4"/>
-              <w:right w:val="single" w:color="BFBFBF" w:sz="4"/>
-            </w:tcBorders>
-            <w:shd w:fill="F2F5FA" w:color="auto" w:val="clear"/>
-            <w:tcMar>
-              <w:top w:type="dxa" w:w="90"/>
-              <w:left w:type="dxa" w:w="140"/>
-              <w:bottom w:type="dxa" w:w="90"/>
-              <w:right w:type="dxa" w:w="140"/>
+              <w:top w:val="single" w:color="D0D7E5" w:sz="4"/>
+              <w:left w:val="single" w:color="D0D7E5" w:sz="4"/>
+              <w:bottom w:val="single" w:color="D0D7E5" w:sz="4"/>
+              <w:right w:val="single" w:color="D0D7E5" w:sz="4"/>
+            </w:tcBorders>
+            <w:shd w:fill="F4F6FA" w:color="auto" w:val="clear"/>
+            <w:tcMar>
+              <w:top w:type="dxa" w:w="165"/>
+              <w:left w:type="dxa" w:w="150"/>
+              <w:bottom w:type="dxa" w:w="165"/>
+              <w:right w:type="dxa" w:w="150"/>
             </w:tcMar>
             <w:vAlign w:val="center"/>
           </w:tcPr>
@@ -451,8 +450,8 @@
                 <w:b/>
                 <w:bCs/>
                 <w:color w:val="1F3864"/>
-                <w:sz w:val="20"/>
-                <w:szCs w:val="20"/>
+                <w:sz w:val="19"/>
+                <w:szCs w:val="19"/>
               </w:rPr>
               <w:t xml:space="preserve">Дата проведения торгов</w:t>
             </w:r>
@@ -462,16 +461,16 @@
           <w:tcPr>
             <w:tcW w:type="dxa" w:w="6538"/>
             <w:tcBorders>
-              <w:top w:val="single" w:color="BFBFBF" w:sz="4"/>
-              <w:left w:val="single" w:color="BFBFBF" w:sz="4"/>
-              <w:bottom w:val="single" w:color="BFBFBF" w:sz="4"/>
-              <w:right w:val="single" w:color="BFBFBF" w:sz="4"/>
-            </w:tcBorders>
-            <w:tcMar>
-              <w:top w:type="dxa" w:w="90"/>
-              <w:left w:type="dxa" w:w="140"/>
-              <w:bottom w:type="dxa" w:w="90"/>
-              <w:right w:type="dxa" w:w="140"/>
+              <w:top w:val="single" w:color="D0D7E5" w:sz="4"/>
+              <w:left w:val="single" w:color="D0D7E5" w:sz="4"/>
+              <w:bottom w:val="single" w:color="D0D7E5" w:sz="4"/>
+              <w:right w:val="single" w:color="D0D7E5" w:sz="4"/>
+            </w:tcBorders>
+            <w:tcMar>
+              <w:top w:type="dxa" w:w="165"/>
+              <w:left w:type="dxa" w:w="150"/>
+              <w:bottom w:type="dxa" w:w="165"/>
+              <w:right w:type="dxa" w:w="150"/>
             </w:tcMar>
             <w:vAlign w:val="center"/>
           </w:tcPr>
@@ -481,9 +480,9 @@
                 <w:rFonts w:ascii="Arial" w:cs="Arial" w:eastAsia="Arial" w:hAnsi="Arial"/>
                 <w:b w:val="false"/>
                 <w:bCs w:val="false"/>
-                <w:color w:val="000000"/>
-                <w:sz w:val="21"/>
-                <w:szCs w:val="21"/>
+                <w:color w:val="1A1A1A"/>
+                <w:sz w:val="19"/>
+                <w:szCs w:val="19"/>
               </w:rPr>
               <w:t xml:space="preserve">29.10.2026, 10:00 (МСК)</w:t>
             </w:r>
@@ -495,17 +494,17 @@
           <w:tcPr>
             <w:tcW w:type="dxa" w:w="3100"/>
             <w:tcBorders>
-              <w:top w:val="single" w:color="BFBFBF" w:sz="4"/>
-              <w:left w:val="single" w:color="BFBFBF" w:sz="4"/>
-              <w:bottom w:val="single" w:color="BFBFBF" w:sz="4"/>
-              <w:right w:val="single" w:color="BFBFBF" w:sz="4"/>
-            </w:tcBorders>
-            <w:shd w:fill="F2F5FA" w:color="auto" w:val="clear"/>
-            <w:tcMar>
-              <w:top w:type="dxa" w:w="90"/>
-              <w:left w:type="dxa" w:w="140"/>
-              <w:bottom w:type="dxa" w:w="90"/>
-              <w:right w:type="dxa" w:w="140"/>
+              <w:top w:val="single" w:color="D0D7E5" w:sz="4"/>
+              <w:left w:val="single" w:color="D0D7E5" w:sz="4"/>
+              <w:bottom w:val="single" w:color="D0D7E5" w:sz="4"/>
+              <w:right w:val="single" w:color="D0D7E5" w:sz="4"/>
+            </w:tcBorders>
+            <w:shd w:fill="F4F6FA" w:color="auto" w:val="clear"/>
+            <w:tcMar>
+              <w:top w:type="dxa" w:w="165"/>
+              <w:left w:type="dxa" w:w="150"/>
+              <w:bottom w:type="dxa" w:w="165"/>
+              <w:right w:type="dxa" w:w="150"/>
             </w:tcMar>
             <w:vAlign w:val="center"/>
           </w:tcPr>
@@ -516,8 +515,8 @@
                 <w:b/>
                 <w:bCs/>
                 <w:color w:val="1F3864"/>
-                <w:sz w:val="20"/>
-                <w:szCs w:val="20"/>
+                <w:sz w:val="19"/>
+                <w:szCs w:val="19"/>
               </w:rPr>
               <w:t xml:space="preserve">Задаток</w:t>
             </w:r>
@@ -527,16 +526,16 @@
           <w:tcPr>
             <w:tcW w:type="dxa" w:w="6538"/>
             <w:tcBorders>
-              <w:top w:val="single" w:color="BFBFBF" w:sz="4"/>
-              <w:left w:val="single" w:color="BFBFBF" w:sz="4"/>
-              <w:bottom w:val="single" w:color="BFBFBF" w:sz="4"/>
-              <w:right w:val="single" w:color="BFBFBF" w:sz="4"/>
-            </w:tcBorders>
-            <w:tcMar>
-              <w:top w:type="dxa" w:w="90"/>
-              <w:left w:type="dxa" w:w="140"/>
-              <w:bottom w:type="dxa" w:w="90"/>
-              <w:right w:type="dxa" w:w="140"/>
+              <w:top w:val="single" w:color="D0D7E5" w:sz="4"/>
+              <w:left w:val="single" w:color="D0D7E5" w:sz="4"/>
+              <w:bottom w:val="single" w:color="D0D7E5" w:sz="4"/>
+              <w:right w:val="single" w:color="D0D7E5" w:sz="4"/>
+            </w:tcBorders>
+            <w:tcMar>
+              <w:top w:type="dxa" w:w="165"/>
+              <w:left w:type="dxa" w:w="150"/>
+              <w:bottom w:type="dxa" w:w="165"/>
+              <w:right w:type="dxa" w:w="150"/>
             </w:tcMar>
             <w:vAlign w:val="center"/>
           </w:tcPr>
@@ -546,9 +545,9 @@
                 <w:rFonts w:ascii="Arial" w:cs="Arial" w:eastAsia="Arial" w:hAnsi="Arial"/>
                 <w:b/>
                 <w:bCs/>
-                <w:color w:val="C00000"/>
-                <w:sz w:val="26"/>
-                <w:szCs w:val="26"/>
+                <w:color w:val="A3161B"/>
+                <w:sz w:val="22"/>
+                <w:szCs w:val="22"/>
               </w:rPr>
               <w:t xml:space="preserve">1 047 860,00 руб.</w:t>
             </w:r>
@@ -559,7 +558,7 @@
     <w:p>
       <w:pPr>
         <w:pBdr>
-          <w:bottom w:val="single" w:color="BFBFBF" w:sz="4"/>
+          <w:bottom w:val="single" w:color="D0D7E5" w:sz="4"/>
         </w:pBdr>
         <w:spacing w:after="120" w:before="240"/>
       </w:pPr>
@@ -568,10 +567,10 @@
           <w:rFonts w:ascii="Arial" w:cs="Arial" w:eastAsia="Arial" w:hAnsi="Arial"/>
           <w:b/>
           <w:bCs/>
-          <w:color w:val="595959"/>
-          <w:spacing w:val="30"/>
-          <w:sz w:val="20"/>
-          <w:szCs w:val="20"/>
+          <w:color w:val="767676"/>
+          <w:spacing w:val="40"/>
+          <w:sz w:val="17"/>
+          <w:szCs w:val="17"/>
         </w:rPr>
         <w:t xml:space="preserve">ДОПОЛНИТЕЛЬНЫЕ СВЕДЕНИЯ</w:t>
       </w:r>
@@ -597,17 +596,17 @@
           <w:tcPr>
             <w:tcW w:type="dxa" w:w="3100"/>
             <w:tcBorders>
-              <w:top w:val="single" w:color="BFBFBF" w:sz="4"/>
-              <w:left w:val="single" w:color="BFBFBF" w:sz="4"/>
-              <w:bottom w:val="single" w:color="BFBFBF" w:sz="4"/>
-              <w:right w:val="single" w:color="BFBFBF" w:sz="4"/>
-            </w:tcBorders>
-            <w:shd w:fill="F2F5FA" w:color="auto" w:val="clear"/>
-            <w:tcMar>
-              <w:top w:type="dxa" w:w="90"/>
-              <w:left w:type="dxa" w:w="140"/>
-              <w:bottom w:type="dxa" w:w="90"/>
-              <w:right w:type="dxa" w:w="140"/>
+              <w:top w:val="single" w:color="D0D7E5" w:sz="4"/>
+              <w:left w:val="single" w:color="D0D7E5" w:sz="4"/>
+              <w:bottom w:val="single" w:color="D0D7E5" w:sz="4"/>
+              <w:right w:val="single" w:color="D0D7E5" w:sz="4"/>
+            </w:tcBorders>
+            <w:shd w:fill="F4F6FA" w:color="auto" w:val="clear"/>
+            <w:tcMar>
+              <w:top w:type="dxa" w:w="165"/>
+              <w:left w:type="dxa" w:w="150"/>
+              <w:bottom w:type="dxa" w:w="165"/>
+              <w:right w:type="dxa" w:w="150"/>
             </w:tcMar>
             <w:vAlign w:val="center"/>
           </w:tcPr>
@@ -618,8 +617,8 @@
                 <w:b/>
                 <w:bCs/>
                 <w:color w:val="1F3864"/>
-                <w:sz w:val="20"/>
-                <w:szCs w:val="20"/>
+                <w:sz w:val="19"/>
+                <w:szCs w:val="19"/>
               </w:rPr>
               <w:t xml:space="preserve">Площадь</w:t>
             </w:r>
@@ -629,16 +628,16 @@
           <w:tcPr>
             <w:tcW w:type="dxa" w:w="6538"/>
             <w:tcBorders>
-              <w:top w:val="single" w:color="BFBFBF" w:sz="4"/>
-              <w:left w:val="single" w:color="BFBFBF" w:sz="4"/>
-              <w:bottom w:val="single" w:color="BFBFBF" w:sz="4"/>
-              <w:right w:val="single" w:color="BFBFBF" w:sz="4"/>
-            </w:tcBorders>
-            <w:tcMar>
-              <w:top w:type="dxa" w:w="90"/>
-              <w:left w:type="dxa" w:w="140"/>
-              <w:bottom w:type="dxa" w:w="90"/>
-              <w:right w:type="dxa" w:w="140"/>
+              <w:top w:val="single" w:color="D0D7E5" w:sz="4"/>
+              <w:left w:val="single" w:color="D0D7E5" w:sz="4"/>
+              <w:bottom w:val="single" w:color="D0D7E5" w:sz="4"/>
+              <w:right w:val="single" w:color="D0D7E5" w:sz="4"/>
+            </w:tcBorders>
+            <w:tcMar>
+              <w:top w:type="dxa" w:w="165"/>
+              <w:left w:type="dxa" w:w="150"/>
+              <w:bottom w:type="dxa" w:w="165"/>
+              <w:right w:type="dxa" w:w="150"/>
             </w:tcMar>
             <w:vAlign w:val="center"/>
           </w:tcPr>
@@ -648,9 +647,9 @@
                 <w:rFonts w:ascii="Arial" w:cs="Arial" w:eastAsia="Arial" w:hAnsi="Arial"/>
                 <w:b w:val="false"/>
                 <w:bCs w:val="false"/>
-                <w:color w:val="000000"/>
-                <w:sz w:val="21"/>
-                <w:szCs w:val="21"/>
+                <w:color w:val="1A1A1A"/>
+                <w:sz w:val="19"/>
+                <w:szCs w:val="19"/>
               </w:rPr>
               <w:t xml:space="preserve">96 м² (жилая 96 м², кухня 13 м²)</w:t>
             </w:r>
@@ -662,17 +661,17 @@
           <w:tcPr>
             <w:tcW w:type="dxa" w:w="3100"/>
             <w:tcBorders>
-              <w:top w:val="single" w:color="BFBFBF" w:sz="4"/>
-              <w:left w:val="single" w:color="BFBFBF" w:sz="4"/>
-              <w:bottom w:val="single" w:color="BFBFBF" w:sz="4"/>
-              <w:right w:val="single" w:color="BFBFBF" w:sz="4"/>
-            </w:tcBorders>
-            <w:shd w:fill="F2F5FA" w:color="auto" w:val="clear"/>
-            <w:tcMar>
-              <w:top w:type="dxa" w:w="90"/>
-              <w:left w:type="dxa" w:w="140"/>
-              <w:bottom w:type="dxa" w:w="90"/>
-              <w:right w:type="dxa" w:w="140"/>
+              <w:top w:val="single" w:color="D0D7E5" w:sz="4"/>
+              <w:left w:val="single" w:color="D0D7E5" w:sz="4"/>
+              <w:bottom w:val="single" w:color="D0D7E5" w:sz="4"/>
+              <w:right w:val="single" w:color="D0D7E5" w:sz="4"/>
+            </w:tcBorders>
+            <w:shd w:fill="F4F6FA" w:color="auto" w:val="clear"/>
+            <w:tcMar>
+              <w:top w:type="dxa" w:w="165"/>
+              <w:left w:type="dxa" w:w="150"/>
+              <w:bottom w:type="dxa" w:w="165"/>
+              <w:right w:type="dxa" w:w="150"/>
             </w:tcMar>
             <w:vAlign w:val="center"/>
           </w:tcPr>
@@ -683,8 +682,8 @@
                 <w:b/>
                 <w:bCs/>
                 <w:color w:val="1F3864"/>
-                <w:sz w:val="20"/>
-                <w:szCs w:val="20"/>
+                <w:sz w:val="19"/>
+                <w:szCs w:val="19"/>
               </w:rPr>
               <w:t xml:space="preserve">Этаж</w:t>
             </w:r>
@@ -694,16 +693,16 @@
           <w:tcPr>
             <w:tcW w:type="dxa" w:w="6538"/>
             <w:tcBorders>
-              <w:top w:val="single" w:color="BFBFBF" w:sz="4"/>
-              <w:left w:val="single" w:color="BFBFBF" w:sz="4"/>
-              <w:bottom w:val="single" w:color="BFBFBF" w:sz="4"/>
-              <w:right w:val="single" w:color="BFBFBF" w:sz="4"/>
-            </w:tcBorders>
-            <w:tcMar>
-              <w:top w:type="dxa" w:w="90"/>
-              <w:left w:type="dxa" w:w="140"/>
-              <w:bottom w:type="dxa" w:w="90"/>
-              <w:right w:type="dxa" w:w="140"/>
+              <w:top w:val="single" w:color="D0D7E5" w:sz="4"/>
+              <w:left w:val="single" w:color="D0D7E5" w:sz="4"/>
+              <w:bottom w:val="single" w:color="D0D7E5" w:sz="4"/>
+              <w:right w:val="single" w:color="D0D7E5" w:sz="4"/>
+            </w:tcBorders>
+            <w:tcMar>
+              <w:top w:type="dxa" w:w="165"/>
+              <w:left w:type="dxa" w:w="150"/>
+              <w:bottom w:type="dxa" w:w="165"/>
+              <w:right w:type="dxa" w:w="150"/>
             </w:tcMar>
             <w:vAlign w:val="center"/>
           </w:tcPr>
@@ -713,9 +712,9 @@
                 <w:rFonts w:ascii="Arial" w:cs="Arial" w:eastAsia="Arial" w:hAnsi="Arial"/>
                 <w:b w:val="false"/>
                 <w:bCs w:val="false"/>
-                <w:color w:val="000000"/>
-                <w:sz w:val="21"/>
-                <w:szCs w:val="21"/>
+                <w:color w:val="1A1A1A"/>
+                <w:sz w:val="19"/>
+                <w:szCs w:val="19"/>
               </w:rPr>
               <w:t xml:space="preserve">2 из 3</w:t>
             </w:r>
@@ -727,17 +726,17 @@
           <w:tcPr>
             <w:tcW w:type="dxa" w:w="3100"/>
             <w:tcBorders>
-              <w:top w:val="single" w:color="BFBFBF" w:sz="4"/>
-              <w:left w:val="single" w:color="BFBFBF" w:sz="4"/>
-              <w:bottom w:val="single" w:color="BFBFBF" w:sz="4"/>
-              <w:right w:val="single" w:color="BFBFBF" w:sz="4"/>
-            </w:tcBorders>
-            <w:shd w:fill="F2F5FA" w:color="auto" w:val="clear"/>
-            <w:tcMar>
-              <w:top w:type="dxa" w:w="90"/>
-              <w:left w:type="dxa" w:w="140"/>
-              <w:bottom w:type="dxa" w:w="90"/>
-              <w:right w:type="dxa" w:w="140"/>
+              <w:top w:val="single" w:color="D0D7E5" w:sz="4"/>
+              <w:left w:val="single" w:color="D0D7E5" w:sz="4"/>
+              <w:bottom w:val="single" w:color="D0D7E5" w:sz="4"/>
+              <w:right w:val="single" w:color="D0D7E5" w:sz="4"/>
+            </w:tcBorders>
+            <w:shd w:fill="F4F6FA" w:color="auto" w:val="clear"/>
+            <w:tcMar>
+              <w:top w:type="dxa" w:w="165"/>
+              <w:left w:type="dxa" w:w="150"/>
+              <w:bottom w:type="dxa" w:w="165"/>
+              <w:right w:type="dxa" w:w="150"/>
             </w:tcMar>
             <w:vAlign w:val="center"/>
           </w:tcPr>
@@ -748,8 +747,8 @@
                 <w:b/>
                 <w:bCs/>
                 <w:color w:val="1F3864"/>
-                <w:sz w:val="20"/>
-                <w:szCs w:val="20"/>
+                <w:sz w:val="19"/>
+                <w:szCs w:val="19"/>
               </w:rPr>
               <w:t xml:space="preserve">Год постройки</w:t>
             </w:r>
@@ -759,16 +758,16 @@
           <w:tcPr>
             <w:tcW w:type="dxa" w:w="6538"/>
             <w:tcBorders>
-              <w:top w:val="single" w:color="BFBFBF" w:sz="4"/>
-              <w:left w:val="single" w:color="BFBFBF" w:sz="4"/>
-              <w:bottom w:val="single" w:color="BFBFBF" w:sz="4"/>
-              <w:right w:val="single" w:color="BFBFBF" w:sz="4"/>
-            </w:tcBorders>
-            <w:tcMar>
-              <w:top w:type="dxa" w:w="90"/>
-              <w:left w:type="dxa" w:w="140"/>
-              <w:bottom w:type="dxa" w:w="90"/>
-              <w:right w:type="dxa" w:w="140"/>
+              <w:top w:val="single" w:color="D0D7E5" w:sz="4"/>
+              <w:left w:val="single" w:color="D0D7E5" w:sz="4"/>
+              <w:bottom w:val="single" w:color="D0D7E5" w:sz="4"/>
+              <w:right w:val="single" w:color="D0D7E5" w:sz="4"/>
+            </w:tcBorders>
+            <w:tcMar>
+              <w:top w:type="dxa" w:w="165"/>
+              <w:left w:type="dxa" w:w="150"/>
+              <w:bottom w:type="dxa" w:w="165"/>
+              <w:right w:type="dxa" w:w="150"/>
             </w:tcMar>
             <w:vAlign w:val="center"/>
           </w:tcPr>
@@ -778,9 +777,9 @@
                 <w:rFonts w:ascii="Arial" w:cs="Arial" w:eastAsia="Arial" w:hAnsi="Arial"/>
                 <w:b w:val="false"/>
                 <w:bCs w:val="false"/>
-                <w:color w:val="000000"/>
-                <w:sz w:val="21"/>
-                <w:szCs w:val="21"/>
+                <w:color w:val="1A1A1A"/>
+                <w:sz w:val="19"/>
+                <w:szCs w:val="19"/>
               </w:rPr>
               <w:t xml:space="preserve">1917</w:t>
             </w:r>
@@ -792,17 +791,17 @@
           <w:tcPr>
             <w:tcW w:type="dxa" w:w="3100"/>
             <w:tcBorders>
-              <w:top w:val="single" w:color="BFBFBF" w:sz="4"/>
-              <w:left w:val="single" w:color="BFBFBF" w:sz="4"/>
-              <w:bottom w:val="single" w:color="BFBFBF" w:sz="4"/>
-              <w:right w:val="single" w:color="BFBFBF" w:sz="4"/>
-            </w:tcBorders>
-            <w:shd w:fill="F2F5FA" w:color="auto" w:val="clear"/>
-            <w:tcMar>
-              <w:top w:type="dxa" w:w="90"/>
-              <w:left w:type="dxa" w:w="140"/>
-              <w:bottom w:type="dxa" w:w="90"/>
-              <w:right w:type="dxa" w:w="140"/>
+              <w:top w:val="single" w:color="D0D7E5" w:sz="4"/>
+              <w:left w:val="single" w:color="D0D7E5" w:sz="4"/>
+              <w:bottom w:val="single" w:color="D0D7E5" w:sz="4"/>
+              <w:right w:val="single" w:color="D0D7E5" w:sz="4"/>
+            </w:tcBorders>
+            <w:shd w:fill="F4F6FA" w:color="auto" w:val="clear"/>
+            <w:tcMar>
+              <w:top w:type="dxa" w:w="165"/>
+              <w:left w:type="dxa" w:w="150"/>
+              <w:bottom w:type="dxa" w:w="165"/>
+              <w:right w:type="dxa" w:w="150"/>
             </w:tcMar>
             <w:vAlign w:val="center"/>
           </w:tcPr>
@@ -813,8 +812,8 @@
                 <w:b/>
                 <w:bCs/>
                 <w:color w:val="1F3864"/>
-                <w:sz w:val="20"/>
-                <w:szCs w:val="20"/>
+                <w:sz w:val="19"/>
+                <w:szCs w:val="19"/>
               </w:rPr>
               <w:t xml:space="preserve">Метро</w:t>
             </w:r>
@@ -824,16 +823,16 @@
           <w:tcPr>
             <w:tcW w:type="dxa" w:w="6538"/>
             <w:tcBorders>
-              <w:top w:val="single" w:color="BFBFBF" w:sz="4"/>
-              <w:left w:val="single" w:color="BFBFBF" w:sz="4"/>
-              <w:bottom w:val="single" w:color="BFBFBF" w:sz="4"/>
-              <w:right w:val="single" w:color="BFBFBF" w:sz="4"/>
-            </w:tcBorders>
-            <w:tcMar>
-              <w:top w:type="dxa" w:w="90"/>
-              <w:left w:type="dxa" w:w="140"/>
-              <w:bottom w:type="dxa" w:w="90"/>
-              <w:right w:type="dxa" w:w="140"/>
+              <w:top w:val="single" w:color="D0D7E5" w:sz="4"/>
+              <w:left w:val="single" w:color="D0D7E5" w:sz="4"/>
+              <w:bottom w:val="single" w:color="D0D7E5" w:sz="4"/>
+              <w:right w:val="single" w:color="D0D7E5" w:sz="4"/>
+            </w:tcBorders>
+            <w:tcMar>
+              <w:top w:type="dxa" w:w="165"/>
+              <w:left w:type="dxa" w:w="150"/>
+              <w:bottom w:type="dxa" w:w="165"/>
+              <w:right w:type="dxa" w:w="150"/>
             </w:tcMar>
             <w:vAlign w:val="center"/>
           </w:tcPr>
@@ -843,9 +842,9 @@
                 <w:rFonts w:ascii="Arial" w:cs="Arial" w:eastAsia="Arial" w:hAnsi="Arial"/>
                 <w:b w:val="false"/>
                 <w:bCs w:val="false"/>
-                <w:color w:val="000000"/>
-                <w:sz w:val="21"/>
-                <w:szCs w:val="21"/>
+                <w:color w:val="1A1A1A"/>
+                <w:sz w:val="19"/>
+                <w:szCs w:val="19"/>
               </w:rPr>
               <w:t xml:space="preserve">«Трубная» — 7 минут пешком</w:t>
             </w:r>
@@ -857,17 +856,17 @@
           <w:tcPr>
             <w:tcW w:type="dxa" w:w="3100"/>
             <w:tcBorders>
-              <w:top w:val="single" w:color="BFBFBF" w:sz="4"/>
-              <w:left w:val="single" w:color="BFBFBF" w:sz="4"/>
-              <w:bottom w:val="single" w:color="BFBFBF" w:sz="4"/>
-              <w:right w:val="single" w:color="BFBFBF" w:sz="4"/>
-            </w:tcBorders>
-            <w:shd w:fill="F2F5FA" w:color="auto" w:val="clear"/>
-            <w:tcMar>
-              <w:top w:type="dxa" w:w="90"/>
-              <w:left w:type="dxa" w:w="140"/>
-              <w:bottom w:type="dxa" w:w="90"/>
-              <w:right w:type="dxa" w:w="140"/>
+              <w:top w:val="single" w:color="D0D7E5" w:sz="4"/>
+              <w:left w:val="single" w:color="D0D7E5" w:sz="4"/>
+              <w:bottom w:val="single" w:color="D0D7E5" w:sz="4"/>
+              <w:right w:val="single" w:color="D0D7E5" w:sz="4"/>
+            </w:tcBorders>
+            <w:shd w:fill="F4F6FA" w:color="auto" w:val="clear"/>
+            <w:tcMar>
+              <w:top w:type="dxa" w:w="165"/>
+              <w:left w:type="dxa" w:w="150"/>
+              <w:bottom w:type="dxa" w:w="165"/>
+              <w:right w:type="dxa" w:w="150"/>
             </w:tcMar>
             <w:vAlign w:val="center"/>
           </w:tcPr>
@@ -878,8 +877,8 @@
                 <w:b/>
                 <w:bCs/>
                 <w:color w:val="1F3864"/>
-                <w:sz w:val="20"/>
-                <w:szCs w:val="20"/>
+                <w:sz w:val="19"/>
+                <w:szCs w:val="19"/>
               </w:rPr>
               <w:t xml:space="preserve">Шаг аукциона</w:t>
             </w:r>
@@ -889,16 +888,16 @@
           <w:tcPr>
             <w:tcW w:type="dxa" w:w="6538"/>
             <w:tcBorders>
-              <w:top w:val="single" w:color="BFBFBF" w:sz="4"/>
-              <w:left w:val="single" w:color="BFBFBF" w:sz="4"/>
-              <w:bottom w:val="single" w:color="BFBFBF" w:sz="4"/>
-              <w:right w:val="single" w:color="BFBFBF" w:sz="4"/>
-            </w:tcBorders>
-            <w:tcMar>
-              <w:top w:type="dxa" w:w="90"/>
-              <w:left w:type="dxa" w:w="140"/>
-              <w:bottom w:type="dxa" w:w="90"/>
-              <w:right w:type="dxa" w:w="140"/>
+              <w:top w:val="single" w:color="D0D7E5" w:sz="4"/>
+              <w:left w:val="single" w:color="D0D7E5" w:sz="4"/>
+              <w:bottom w:val="single" w:color="D0D7E5" w:sz="4"/>
+              <w:right w:val="single" w:color="D0D7E5" w:sz="4"/>
+            </w:tcBorders>
+            <w:tcMar>
+              <w:top w:type="dxa" w:w="165"/>
+              <w:left w:type="dxa" w:w="150"/>
+              <w:bottom w:type="dxa" w:w="165"/>
+              <w:right w:type="dxa" w:w="150"/>
             </w:tcMar>
             <w:vAlign w:val="center"/>
           </w:tcPr>
@@ -908,9 +907,9 @@
                 <w:rFonts w:ascii="Arial" w:cs="Arial" w:eastAsia="Arial" w:hAnsi="Arial"/>
                 <w:b w:val="false"/>
                 <w:bCs w:val="false"/>
-                <w:color w:val="000000"/>
-                <w:sz w:val="21"/>
-                <w:szCs w:val="21"/>
+                <w:color w:val="1A1A1A"/>
+                <w:sz w:val="19"/>
+                <w:szCs w:val="19"/>
               </w:rPr>
               <w:t xml:space="preserve">261 965,00 руб.</w:t>
             </w:r>
@@ -922,17 +921,17 @@
           <w:tcPr>
             <w:tcW w:type="dxa" w:w="3100"/>
             <w:tcBorders>
-              <w:top w:val="single" w:color="BFBFBF" w:sz="4"/>
-              <w:left w:val="single" w:color="BFBFBF" w:sz="4"/>
-              <w:bottom w:val="single" w:color="BFBFBF" w:sz="4"/>
-              <w:right w:val="single" w:color="BFBFBF" w:sz="4"/>
-            </w:tcBorders>
-            <w:shd w:fill="F2F5FA" w:color="auto" w:val="clear"/>
-            <w:tcMar>
-              <w:top w:type="dxa" w:w="90"/>
-              <w:left w:type="dxa" w:w="140"/>
-              <w:bottom w:type="dxa" w:w="90"/>
-              <w:right w:type="dxa" w:w="140"/>
+              <w:top w:val="single" w:color="D0D7E5" w:sz="4"/>
+              <w:left w:val="single" w:color="D0D7E5" w:sz="4"/>
+              <w:bottom w:val="single" w:color="D0D7E5" w:sz="4"/>
+              <w:right w:val="single" w:color="D0D7E5" w:sz="4"/>
+            </w:tcBorders>
+            <w:shd w:fill="F4F6FA" w:color="auto" w:val="clear"/>
+            <w:tcMar>
+              <w:top w:type="dxa" w:w="165"/>
+              <w:left w:type="dxa" w:w="150"/>
+              <w:bottom w:type="dxa" w:w="165"/>
+              <w:right w:type="dxa" w:w="150"/>
             </w:tcMar>
             <w:vAlign w:val="center"/>
           </w:tcPr>
@@ -943,8 +942,8 @@
                 <w:b/>
                 <w:bCs/>
                 <w:color w:val="1F3864"/>
-                <w:sz w:val="20"/>
-                <w:szCs w:val="20"/>
+                <w:sz w:val="19"/>
+                <w:szCs w:val="19"/>
               </w:rPr>
               <w:t xml:space="preserve">Форма проведения</w:t>
             </w:r>
@@ -954,16 +953,16 @@
           <w:tcPr>
             <w:tcW w:type="dxa" w:w="6538"/>
             <w:tcBorders>
-              <w:top w:val="single" w:color="BFBFBF" w:sz="4"/>
-              <w:left w:val="single" w:color="BFBFBF" w:sz="4"/>
-              <w:bottom w:val="single" w:color="BFBFBF" w:sz="4"/>
-              <w:right w:val="single" w:color="BFBFBF" w:sz="4"/>
-            </w:tcBorders>
-            <w:tcMar>
-              <w:top w:type="dxa" w:w="90"/>
-              <w:left w:type="dxa" w:w="140"/>
-              <w:bottom w:type="dxa" w:w="90"/>
-              <w:right w:type="dxa" w:w="140"/>
+              <w:top w:val="single" w:color="D0D7E5" w:sz="4"/>
+              <w:left w:val="single" w:color="D0D7E5" w:sz="4"/>
+              <w:bottom w:val="single" w:color="D0D7E5" w:sz="4"/>
+              <w:right w:val="single" w:color="D0D7E5" w:sz="4"/>
+            </w:tcBorders>
+            <w:tcMar>
+              <w:top w:type="dxa" w:w="165"/>
+              <w:left w:type="dxa" w:w="150"/>
+              <w:bottom w:type="dxa" w:w="165"/>
+              <w:right w:type="dxa" w:w="150"/>
             </w:tcMar>
             <w:vAlign w:val="center"/>
           </w:tcPr>
@@ -973,9 +972,9 @@
                 <w:rFonts w:ascii="Arial" w:cs="Arial" w:eastAsia="Arial" w:hAnsi="Arial"/>
                 <w:b w:val="false"/>
                 <w:bCs w:val="false"/>
-                <w:color w:val="000000"/>
-                <w:sz w:val="21"/>
-                <w:szCs w:val="21"/>
+                <w:color w:val="1A1A1A"/>
+                <w:sz w:val="19"/>
+                <w:szCs w:val="19"/>
               </w:rPr>
               <w:t xml:space="preserve">Открытый аукцион в электронной форме</w:t>
             </w:r>
@@ -987,17 +986,17 @@
           <w:tcPr>
             <w:tcW w:type="dxa" w:w="3100"/>
             <w:tcBorders>
-              <w:top w:val="single" w:color="BFBFBF" w:sz="4"/>
-              <w:left w:val="single" w:color="BFBFBF" w:sz="4"/>
-              <w:bottom w:val="single" w:color="BFBFBF" w:sz="4"/>
-              <w:right w:val="single" w:color="BFBFBF" w:sz="4"/>
-            </w:tcBorders>
-            <w:shd w:fill="F2F5FA" w:color="auto" w:val="clear"/>
-            <w:tcMar>
-              <w:top w:type="dxa" w:w="90"/>
-              <w:left w:type="dxa" w:w="140"/>
-              <w:bottom w:type="dxa" w:w="90"/>
-              <w:right w:type="dxa" w:w="140"/>
+              <w:top w:val="single" w:color="D0D7E5" w:sz="4"/>
+              <w:left w:val="single" w:color="D0D7E5" w:sz="4"/>
+              <w:bottom w:val="single" w:color="D0D7E5" w:sz="4"/>
+              <w:right w:val="single" w:color="D0D7E5" w:sz="4"/>
+            </w:tcBorders>
+            <w:shd w:fill="F4F6FA" w:color="auto" w:val="clear"/>
+            <w:tcMar>
+              <w:top w:type="dxa" w:w="165"/>
+              <w:left w:type="dxa" w:w="150"/>
+              <w:bottom w:type="dxa" w:w="165"/>
+              <w:right w:type="dxa" w:w="150"/>
             </w:tcMar>
             <w:vAlign w:val="center"/>
           </w:tcPr>
@@ -1008,8 +1007,8 @@
                 <w:b/>
                 <w:bCs/>
                 <w:color w:val="1F3864"/>
-                <w:sz w:val="20"/>
-                <w:szCs w:val="20"/>
+                <w:sz w:val="19"/>
+                <w:szCs w:val="19"/>
               </w:rPr>
               <w:t xml:space="preserve">Кадастровый номер</w:t>
             </w:r>
@@ -1019,16 +1018,16 @@
           <w:tcPr>
             <w:tcW w:type="dxa" w:w="6538"/>
             <w:tcBorders>
-              <w:top w:val="single" w:color="BFBFBF" w:sz="4"/>
-              <w:left w:val="single" w:color="BFBFBF" w:sz="4"/>
-              <w:bottom w:val="single" w:color="BFBFBF" w:sz="4"/>
-              <w:right w:val="single" w:color="BFBFBF" w:sz="4"/>
-            </w:tcBorders>
-            <w:tcMar>
-              <w:top w:type="dxa" w:w="90"/>
-              <w:left w:type="dxa" w:w="140"/>
-              <w:bottom w:type="dxa" w:w="90"/>
-              <w:right w:type="dxa" w:w="140"/>
+              <w:top w:val="single" w:color="D0D7E5" w:sz="4"/>
+              <w:left w:val="single" w:color="D0D7E5" w:sz="4"/>
+              <w:bottom w:val="single" w:color="D0D7E5" w:sz="4"/>
+              <w:right w:val="single" w:color="D0D7E5" w:sz="4"/>
+            </w:tcBorders>
+            <w:tcMar>
+              <w:top w:type="dxa" w:w="165"/>
+              <w:left w:type="dxa" w:w="150"/>
+              <w:bottom w:type="dxa" w:w="165"/>
+              <w:right w:type="dxa" w:w="150"/>
             </w:tcMar>
             <w:vAlign w:val="center"/>
           </w:tcPr>
@@ -1038,9 +1037,9 @@
                 <w:rFonts w:ascii="Arial" w:cs="Arial" w:eastAsia="Arial" w:hAnsi="Arial"/>
                 <w:b w:val="false"/>
                 <w:bCs w:val="false"/>
-                <w:color w:val="000000"/>
-                <w:sz w:val="21"/>
-                <w:szCs w:val="21"/>
+                <w:color w:val="1A1A1A"/>
+                <w:sz w:val="19"/>
+                <w:szCs w:val="19"/>
               </w:rPr>
               <w:t xml:space="preserve">77:01:0001091:1336</w:t>
             </w:r>
@@ -1052,17 +1051,17 @@
           <w:tcPr>
             <w:tcW w:type="dxa" w:w="3100"/>
             <w:tcBorders>
-              <w:top w:val="single" w:color="BFBFBF" w:sz="4"/>
-              <w:left w:val="single" w:color="BFBFBF" w:sz="4"/>
-              <w:bottom w:val="single" w:color="BFBFBF" w:sz="4"/>
-              <w:right w:val="single" w:color="BFBFBF" w:sz="4"/>
-            </w:tcBorders>
-            <w:shd w:fill="F2F5FA" w:color="auto" w:val="clear"/>
-            <w:tcMar>
-              <w:top w:type="dxa" w:w="90"/>
-              <w:left w:type="dxa" w:w="140"/>
-              <w:bottom w:type="dxa" w:w="90"/>
-              <w:right w:type="dxa" w:w="140"/>
+              <w:top w:val="single" w:color="D0D7E5" w:sz="4"/>
+              <w:left w:val="single" w:color="D0D7E5" w:sz="4"/>
+              <w:bottom w:val="single" w:color="D0D7E5" w:sz="4"/>
+              <w:right w:val="single" w:color="D0D7E5" w:sz="4"/>
+            </w:tcBorders>
+            <w:shd w:fill="F4F6FA" w:color="auto" w:val="clear"/>
+            <w:tcMar>
+              <w:top w:type="dxa" w:w="165"/>
+              <w:left w:type="dxa" w:w="150"/>
+              <w:bottom w:type="dxa" w:w="165"/>
+              <w:right w:type="dxa" w:w="150"/>
             </w:tcMar>
             <w:vAlign w:val="center"/>
           </w:tcPr>
@@ -1073,8 +1072,8 @@
                 <w:b/>
                 <w:bCs/>
                 <w:color w:val="1F3864"/>
-                <w:sz w:val="20"/>
-                <w:szCs w:val="20"/>
+                <w:sz w:val="19"/>
+                <w:szCs w:val="19"/>
               </w:rPr>
               <w:t xml:space="preserve">Номер лота</w:t>
             </w:r>
@@ -1084,16 +1083,16 @@
           <w:tcPr>
             <w:tcW w:type="dxa" w:w="6538"/>
             <w:tcBorders>
-              <w:top w:val="single" w:color="BFBFBF" w:sz="4"/>
-              <w:left w:val="single" w:color="BFBFBF" w:sz="4"/>
-              <w:bottom w:val="single" w:color="BFBFBF" w:sz="4"/>
-              <w:right w:val="single" w:color="BFBFBF" w:sz="4"/>
-            </w:tcBorders>
-            <w:tcMar>
-              <w:top w:type="dxa" w:w="90"/>
-              <w:left w:type="dxa" w:w="140"/>
-              <w:bottom w:type="dxa" w:w="90"/>
-              <w:right w:type="dxa" w:w="140"/>
+              <w:top w:val="single" w:color="D0D7E5" w:sz="4"/>
+              <w:left w:val="single" w:color="D0D7E5" w:sz="4"/>
+              <w:bottom w:val="single" w:color="D0D7E5" w:sz="4"/>
+              <w:right w:val="single" w:color="D0D7E5" w:sz="4"/>
+            </w:tcBorders>
+            <w:tcMar>
+              <w:top w:type="dxa" w:w="165"/>
+              <w:left w:type="dxa" w:w="150"/>
+              <w:bottom w:type="dxa" w:w="165"/>
+              <w:right w:type="dxa" w:w="150"/>
             </w:tcMar>
             <w:vAlign w:val="center"/>
           </w:tcPr>
@@ -1103,9 +1102,9 @@
                 <w:rFonts w:ascii="Arial" w:cs="Arial" w:eastAsia="Arial" w:hAnsi="Arial"/>
                 <w:b w:val="false"/>
                 <w:bCs w:val="false"/>
-                <w:color w:val="000000"/>
-                <w:sz w:val="21"/>
-                <w:szCs w:val="21"/>
+                <w:color w:val="1A1A1A"/>
+                <w:sz w:val="19"/>
+                <w:szCs w:val="19"/>
               </w:rPr>
               <w:t xml:space="preserve">17002658</w:t>
             </w:r>
@@ -1117,17 +1116,17 @@
           <w:tcPr>
             <w:tcW w:type="dxa" w:w="3100"/>
             <w:tcBorders>
-              <w:top w:val="single" w:color="BFBFBF" w:sz="4"/>
-              <w:left w:val="single" w:color="BFBFBF" w:sz="4"/>
-              <w:bottom w:val="single" w:color="BFBFBF" w:sz="4"/>
-              <w:right w:val="single" w:color="BFBFBF" w:sz="4"/>
-            </w:tcBorders>
-            <w:shd w:fill="F2F5FA" w:color="auto" w:val="clear"/>
-            <w:tcMar>
-              <w:top w:type="dxa" w:w="90"/>
-              <w:left w:type="dxa" w:w="140"/>
-              <w:bottom w:type="dxa" w:w="90"/>
-              <w:right w:type="dxa" w:w="140"/>
+              <w:top w:val="single" w:color="D0D7E5" w:sz="4"/>
+              <w:left w:val="single" w:color="D0D7E5" w:sz="4"/>
+              <w:bottom w:val="single" w:color="D0D7E5" w:sz="4"/>
+              <w:right w:val="single" w:color="D0D7E5" w:sz="4"/>
+            </w:tcBorders>
+            <w:shd w:fill="F4F6FA" w:color="auto" w:val="clear"/>
+            <w:tcMar>
+              <w:top w:type="dxa" w:w="165"/>
+              <w:left w:type="dxa" w:w="150"/>
+              <w:bottom w:type="dxa" w:w="165"/>
+              <w:right w:type="dxa" w:w="150"/>
             </w:tcMar>
             <w:vAlign w:val="center"/>
           </w:tcPr>
@@ -1138,8 +1137,8 @@
                 <w:b/>
                 <w:bCs/>
                 <w:color w:val="1F3864"/>
-                <w:sz w:val="20"/>
-                <w:szCs w:val="20"/>
+                <w:sz w:val="19"/>
+                <w:szCs w:val="19"/>
               </w:rPr>
               <w:t xml:space="preserve">Начало приёма заявок</w:t>
             </w:r>
@@ -1149,16 +1148,16 @@
           <w:tcPr>
             <w:tcW w:type="dxa" w:w="6538"/>
             <w:tcBorders>
-              <w:top w:val="single" w:color="BFBFBF" w:sz="4"/>
-              <w:left w:val="single" w:color="BFBFBF" w:sz="4"/>
-              <w:bottom w:val="single" w:color="BFBFBF" w:sz="4"/>
-              <w:right w:val="single" w:color="BFBFBF" w:sz="4"/>
-            </w:tcBorders>
-            <w:tcMar>
-              <w:top w:type="dxa" w:w="90"/>
-              <w:left w:type="dxa" w:w="140"/>
-              <w:bottom w:type="dxa" w:w="90"/>
-              <w:right w:type="dxa" w:w="140"/>
+              <w:top w:val="single" w:color="D0D7E5" w:sz="4"/>
+              <w:left w:val="single" w:color="D0D7E5" w:sz="4"/>
+              <w:bottom w:val="single" w:color="D0D7E5" w:sz="4"/>
+              <w:right w:val="single" w:color="D0D7E5" w:sz="4"/>
+            </w:tcBorders>
+            <w:tcMar>
+              <w:top w:type="dxa" w:w="165"/>
+              <w:left w:type="dxa" w:w="150"/>
+              <w:bottom w:type="dxa" w:w="165"/>
+              <w:right w:type="dxa" w:w="150"/>
             </w:tcMar>
             <w:vAlign w:val="center"/>
           </w:tcPr>
@@ -1168,9 +1167,9 @@
                 <w:rFonts w:ascii="Arial" w:cs="Arial" w:eastAsia="Arial" w:hAnsi="Arial"/>
                 <w:b w:val="false"/>
                 <w:bCs w:val="false"/>
-                <w:color w:val="000000"/>
-                <w:sz w:val="21"/>
-                <w:szCs w:val="21"/>
+                <w:color w:val="1A1A1A"/>
+                <w:sz w:val="19"/>
+                <w:szCs w:val="19"/>
               </w:rPr>
               <w:t xml:space="preserve">31.08.2026, 20:00 (МСК)</w:t>
             </w:r>
@@ -1182,17 +1181,17 @@
           <w:tcPr>
             <w:tcW w:type="dxa" w:w="3100"/>
             <w:tcBorders>
-              <w:top w:val="single" w:color="BFBFBF" w:sz="4"/>
-              <w:left w:val="single" w:color="BFBFBF" w:sz="4"/>
-              <w:bottom w:val="single" w:color="BFBFBF" w:sz="4"/>
-              <w:right w:val="single" w:color="BFBFBF" w:sz="4"/>
-            </w:tcBorders>
-            <w:shd w:fill="F2F5FA" w:color="auto" w:val="clear"/>
-            <w:tcMar>
-              <w:top w:type="dxa" w:w="90"/>
-              <w:left w:type="dxa" w:w="140"/>
-              <w:bottom w:type="dxa" w:w="90"/>
-              <w:right w:type="dxa" w:w="140"/>
+              <w:top w:val="single" w:color="D0D7E5" w:sz="4"/>
+              <w:left w:val="single" w:color="D0D7E5" w:sz="4"/>
+              <w:bottom w:val="single" w:color="D0D7E5" w:sz="4"/>
+              <w:right w:val="single" w:color="D0D7E5" w:sz="4"/>
+            </w:tcBorders>
+            <w:shd w:fill="F4F6FA" w:color="auto" w:val="clear"/>
+            <w:tcMar>
+              <w:top w:type="dxa" w:w="165"/>
+              <w:left w:type="dxa" w:w="150"/>
+              <w:bottom w:type="dxa" w:w="165"/>
+              <w:right w:type="dxa" w:w="150"/>
             </w:tcMar>
             <w:vAlign w:val="center"/>
           </w:tcPr>
@@ -1203,8 +1202,8 @@
                 <w:b/>
                 <w:bCs/>
                 <w:color w:val="1F3864"/>
-                <w:sz w:val="20"/>
-                <w:szCs w:val="20"/>
+                <w:sz w:val="19"/>
+                <w:szCs w:val="19"/>
               </w:rPr>
               <w:t xml:space="preserve">Отбор участников</w:t>
             </w:r>
@@ -1214,16 +1213,16 @@
           <w:tcPr>
             <w:tcW w:type="dxa" w:w="6538"/>
             <w:tcBorders>
-              <w:top w:val="single" w:color="BFBFBF" w:sz="4"/>
-              <w:left w:val="single" w:color="BFBFBF" w:sz="4"/>
-              <w:bottom w:val="single" w:color="BFBFBF" w:sz="4"/>
-              <w:right w:val="single" w:color="BFBFBF" w:sz="4"/>
-            </w:tcBorders>
-            <w:tcMar>
-              <w:top w:type="dxa" w:w="90"/>
-              <w:left w:type="dxa" w:w="140"/>
-              <w:bottom w:type="dxa" w:w="90"/>
-              <w:right w:type="dxa" w:w="140"/>
+              <w:top w:val="single" w:color="D0D7E5" w:sz="4"/>
+              <w:left w:val="single" w:color="D0D7E5" w:sz="4"/>
+              <w:bottom w:val="single" w:color="D0D7E5" w:sz="4"/>
+              <w:right w:val="single" w:color="D0D7E5" w:sz="4"/>
+            </w:tcBorders>
+            <w:tcMar>
+              <w:top w:type="dxa" w:w="165"/>
+              <w:left w:type="dxa" w:w="150"/>
+              <w:bottom w:type="dxa" w:w="165"/>
+              <w:right w:type="dxa" w:w="150"/>
             </w:tcMar>
             <w:vAlign w:val="center"/>
           </w:tcPr>
@@ -1233,9 +1232,9 @@
                 <w:rFonts w:ascii="Arial" w:cs="Arial" w:eastAsia="Arial" w:hAnsi="Arial"/>
                 <w:b w:val="false"/>
                 <w:bCs w:val="false"/>
-                <w:color w:val="000000"/>
-                <w:sz w:val="21"/>
-                <w:szCs w:val="21"/>
+                <w:color w:val="1A1A1A"/>
+                <w:sz w:val="19"/>
+                <w:szCs w:val="19"/>
               </w:rPr>
               <w:t xml:space="preserve">27.10.2026, 10:00 (МСК)</w:t>
             </w:r>
@@ -1247,17 +1246,17 @@
           <w:tcPr>
             <w:tcW w:type="dxa" w:w="3100"/>
             <w:tcBorders>
-              <w:top w:val="single" w:color="BFBFBF" w:sz="4"/>
-              <w:left w:val="single" w:color="BFBFBF" w:sz="4"/>
-              <w:bottom w:val="single" w:color="BFBFBF" w:sz="4"/>
-              <w:right w:val="single" w:color="BFBFBF" w:sz="4"/>
-            </w:tcBorders>
-            <w:shd w:fill="F2F5FA" w:color="auto" w:val="clear"/>
-            <w:tcMar>
-              <w:top w:type="dxa" w:w="90"/>
-              <w:left w:type="dxa" w:w="140"/>
-              <w:bottom w:type="dxa" w:w="90"/>
-              <w:right w:type="dxa" w:w="140"/>
+              <w:top w:val="single" w:color="D0D7E5" w:sz="4"/>
+              <w:left w:val="single" w:color="D0D7E5" w:sz="4"/>
+              <w:bottom w:val="single" w:color="D0D7E5" w:sz="4"/>
+              <w:right w:val="single" w:color="D0D7E5" w:sz="4"/>
+            </w:tcBorders>
+            <w:shd w:fill="F4F6FA" w:color="auto" w:val="clear"/>
+            <w:tcMar>
+              <w:top w:type="dxa" w:w="165"/>
+              <w:left w:type="dxa" w:w="150"/>
+              <w:bottom w:type="dxa" w:w="165"/>
+              <w:right w:type="dxa" w:w="150"/>
             </w:tcMar>
             <w:vAlign w:val="center"/>
           </w:tcPr>
@@ -1268,8 +1267,8 @@
                 <w:b/>
                 <w:bCs/>
                 <w:color w:val="1F3864"/>
-                <w:sz w:val="20"/>
-                <w:szCs w:val="20"/>
+                <w:sz w:val="19"/>
+                <w:szCs w:val="19"/>
               </w:rPr>
               <w:t xml:space="preserve">Подведение итогов</w:t>
             </w:r>
@@ -1279,16 +1278,16 @@
           <w:tcPr>
             <w:tcW w:type="dxa" w:w="6538"/>
             <w:tcBorders>
-              <w:top w:val="single" w:color="BFBFBF" w:sz="4"/>
-              <w:left w:val="single" w:color="BFBFBF" w:sz="4"/>
-              <w:bottom w:val="single" w:color="BFBFBF" w:sz="4"/>
-              <w:right w:val="single" w:color="BFBFBF" w:sz="4"/>
-            </w:tcBorders>
-            <w:tcMar>
-              <w:top w:type="dxa" w:w="90"/>
-              <w:left w:type="dxa" w:w="140"/>
-              <w:bottom w:type="dxa" w:w="90"/>
-              <w:right w:type="dxa" w:w="140"/>
+              <w:top w:val="single" w:color="D0D7E5" w:sz="4"/>
+              <w:left w:val="single" w:color="D0D7E5" w:sz="4"/>
+              <w:bottom w:val="single" w:color="D0D7E5" w:sz="4"/>
+              <w:right w:val="single" w:color="D0D7E5" w:sz="4"/>
+            </w:tcBorders>
+            <w:tcMar>
+              <w:top w:type="dxa" w:w="165"/>
+              <w:left w:type="dxa" w:w="150"/>
+              <w:bottom w:type="dxa" w:w="165"/>
+              <w:right w:type="dxa" w:w="150"/>
             </w:tcMar>
             <w:vAlign w:val="center"/>
           </w:tcPr>
@@ -1298,9 +1297,9 @@
                 <w:rFonts w:ascii="Arial" w:cs="Arial" w:eastAsia="Arial" w:hAnsi="Arial"/>
                 <w:b w:val="false"/>
                 <w:bCs w:val="false"/>
-                <w:color w:val="000000"/>
-                <w:sz w:val="21"/>
-                <w:szCs w:val="21"/>
+                <w:color w:val="1A1A1A"/>
+                <w:sz w:val="19"/>
+                <w:szCs w:val="19"/>
               </w:rPr>
               <w:t xml:space="preserve">29.10.2026, 17:00 (МСК)</w:t>
             </w:r>
@@ -1315,19 +1314,19 @@
       <w:r>
         <w:rPr>
           <w:rFonts w:ascii="Arial" w:cs="Arial" w:eastAsia="Arial" w:hAnsi="Arial"/>
-          <w:color w:val="595959"/>
-          <w:sz w:val="20"/>
-          <w:szCs w:val="20"/>
+          <w:color w:val="767676"/>
+          <w:sz w:val="17"/>
+          <w:szCs w:val="17"/>
         </w:rPr>
         <w:t xml:space="preserve">Объявление: </w:t>
       </w:r>
-      <w:hyperlink w:history="1" r:id="rIdqukh_s-jllevyd7e7nupb">
+      <w:hyperlink w:history="1" r:id="rIdsd7up4v8ask00w8nvwkrm">
         <w:r>
           <w:rPr>
             <w:rFonts w:ascii="Arial" w:cs="Arial" w:eastAsia="Arial" w:hAnsi="Arial"/>
             <w:color w:val="0563C1"/>
-            <w:sz w:val="20"/>
-            <w:szCs w:val="20"/>
+            <w:sz w:val="17"/>
+            <w:szCs w:val="17"/>
             <w:u w:val="single"/>
           </w:rPr>
           <w:t xml:space="preserve">https://investmoscow.ru/tenders/tender/20188709</w:t>
@@ -1342,7 +1341,7 @@
     <w:p>
       <w:pPr>
         <w:pBdr>
-          <w:bottom w:val="single" w:color="BFBFBF" w:sz="4"/>
+          <w:bottom w:val="single" w:color="D0D7E5" w:sz="4"/>
         </w:pBdr>
         <w:spacing w:after="120" w:before="240"/>
       </w:pPr>
@@ -1351,24 +1350,24 @@
           <w:rFonts w:ascii="Arial" w:cs="Arial" w:eastAsia="Arial" w:hAnsi="Arial"/>
           <w:b/>
           <w:bCs/>
-          <w:color w:val="595959"/>
-          <w:spacing w:val="30"/>
-          <w:sz w:val="20"/>
-          <w:szCs w:val="20"/>
+          <w:color w:val="767676"/>
+          <w:spacing w:val="40"/>
+          <w:sz w:val="17"/>
+          <w:szCs w:val="17"/>
         </w:rPr>
         <w:t xml:space="preserve">ЛОКАЦИЯ</w:t>
       </w:r>
     </w:p>
     <w:p>
       <w:pPr>
-        <w:spacing w:after="120"/>
+        <w:spacing w:after="120" w:before="0"/>
       </w:pPr>
       <w:r>
         <w:rPr>
           <w:rFonts w:ascii="Arial" w:cs="Arial" w:eastAsia="Arial" w:hAnsi="Arial"/>
-          <w:color w:val="595959"/>
-          <w:sz w:val="20"/>
-          <w:szCs w:val="20"/>
+          <w:color w:val="767676"/>
+          <w:sz w:val="17"/>
+          <w:szCs w:val="17"/>
         </w:rPr>
         <w:t xml:space="preserve">г. Москва, ЦАО, Мещанский район, Колокольников переулок, д. 15, этаж 2, квартира 13</w:t>
       </w:r>
@@ -1380,7 +1379,7 @@
       <w:r>
         <w:drawing>
           <wp:inline distT="0" distB="0" distL="0" distR="0">
-            <wp:extent cx="5905500" cy="4191000"/>
+            <wp:extent cx="6115050" cy="5010150"/>
             <wp:effectExtent t="0" r="0" b="0" l="0"/>
             <wp:docPr id="1" name="" descr="" title=""/>
             <wp:cNvGraphicFramePr>
@@ -1405,7 +1404,7 @@
                   <pic:spPr bwMode="auto">
                     <a:xfrm>
                       <a:off x="0" y="0"/>
-                      <a:ext cx="5905500" cy="4191000"/>
+                      <a:ext cx="6115050" cy="5010150"/>
                     </a:xfrm>
                     <a:prstGeom prst="rect">
                       <a:avLst/>
@@ -1420,28 +1419,23 @@
     </w:p>
     <w:p>
       <w:pPr>
-        <w:spacing w:before="120"/>
+        <w:spacing w:after="0" w:before="120"/>
         <w:jc w:val="center"/>
       </w:pPr>
       <w:r>
         <w:rPr>
           <w:rFonts w:ascii="Arial" w:cs="Arial" w:eastAsia="Arial" w:hAnsi="Arial"/>
-          <w:color w:val="595959"/>
-          <w:sz w:val="16"/>
-          <w:szCs w:val="16"/>
+          <w:color w:val="767676"/>
+          <w:sz w:val="17"/>
+          <w:szCs w:val="17"/>
         </w:rPr>
-        <w:t xml:space="preserve">Яндекс Карты · координаты 55.768071, 37.628451</w:t>
-      </w:r>
-    </w:p>
-    <w:p>
-      <w:r>
-        <w:br w:type="page"/>
+        <w:t xml:space="preserve">Яндекс Карты · 55.768071, 37.628451 · ближайшее метро «Трубная»</w:t>
       </w:r>
     </w:p>
     <w:p>
       <w:pPr>
         <w:pBdr>
-          <w:bottom w:val="single" w:color="BFBFBF" w:sz="4"/>
+          <w:bottom w:val="single" w:color="D0D7E5" w:sz="4"/>
         </w:pBdr>
         <w:spacing w:after="120" w:before="240"/>
       </w:pPr>
@@ -1450,12 +1444,12 @@
           <w:rFonts w:ascii="Arial" w:cs="Arial" w:eastAsia="Arial" w:hAnsi="Arial"/>
           <w:b/>
           <w:bCs/>
-          <w:color w:val="595959"/>
-          <w:spacing w:val="30"/>
-          <w:sz w:val="20"/>
-          <w:szCs w:val="20"/>
+          <w:color w:val="767676"/>
+          <w:spacing w:val="40"/>
+          <w:sz w:val="17"/>
+          <w:szCs w:val="17"/>
         </w:rPr>
-        <w:t xml:space="preserve">ФОТО ОБЪЕКТА (1–4 ИЗ 18)</w:t>
+        <w:t xml:space="preserve">ФОТО ОБЪЕКТА · 1–2 ИЗ 18</w:t>
       </w:r>
     </w:p>
     <w:tbl>
@@ -1475,6 +1469,9 @@
         <w:gridCol w:w="4819"/>
       </w:tblGrid>
       <w:tr>
+        <w:trPr>
+          <w:trHeight w:val="4560" w:hRule="exact"/>
+        </w:trPr>
         <w:tc>
           <w:tcPr>
             <w:tcW w:type="dxa" w:w="4819"/>
@@ -1485,22 +1482,21 @@
               <w:right w:val="none" w:color="FFFFFF" w:sz="0"/>
             </w:tcBorders>
             <w:tcMar>
-              <w:top w:type="dxa" w:w="120"/>
-              <w:left w:type="dxa" w:w="80"/>
-              <w:bottom w:type="dxa" w:w="120"/>
-              <w:right w:type="dxa" w:w="80"/>
+              <w:top w:type="dxa" w:w="100"/>
+              <w:left w:type="dxa" w:w="85"/>
+              <w:bottom w:type="dxa" w:w="100"/>
+              <w:right w:type="dxa" w:w="85"/>
             </w:tcMar>
             <w:vAlign w:val="center"/>
           </w:tcPr>
           <w:p>
             <w:pPr>
-              <w:spacing w:after="60"/>
               <w:jc w:val="center"/>
             </w:pPr>
             <w:r>
               <w:drawing>
                 <wp:inline distT="0" distB="0" distL="0" distR="0">
-                  <wp:extent cx="2981325" cy="2238375"/>
+                  <wp:extent cx="2952750" cy="2209800"/>
                   <wp:effectExtent t="0" r="0" b="0" l="0"/>
                   <wp:docPr id="1" name="" descr="" title=""/>
                   <wp:cNvGraphicFramePr>
@@ -1525,7 +1521,7 @@
                         <pic:spPr bwMode="auto">
                           <a:xfrm>
                             <a:off x="0" y="0"/>
-                            <a:ext cx="2981325" cy="2238375"/>
+                            <a:ext cx="2952750" cy="2209800"/>
                           </a:xfrm>
                           <a:prstGeom prst="rect">
                             <a:avLst/>
@@ -1538,20 +1534,6 @@
               </w:drawing>
             </w:r>
           </w:p>
-          <w:p>
-            <w:pPr>
-              <w:jc w:val="center"/>
-            </w:pPr>
-            <w:r>
-              <w:rPr>
-                <w:rFonts w:ascii="Arial" w:cs="Arial" w:eastAsia="Arial" w:hAnsi="Arial"/>
-                <w:color w:val="595959"/>
-                <w:sz w:val="16"/>
-                <w:szCs w:val="16"/>
-              </w:rPr>
-              <w:t xml:space="preserve">Фото 1</w:t>
-            </w:r>
-          </w:p>
         </w:tc>
         <w:tc>
           <w:tcPr>
@@ -1563,22 +1545,21 @@
               <w:right w:val="none" w:color="FFFFFF" w:sz="0"/>
             </w:tcBorders>
             <w:tcMar>
-              <w:top w:type="dxa" w:w="120"/>
-              <w:left w:type="dxa" w:w="80"/>
-              <w:bottom w:type="dxa" w:w="120"/>
-              <w:right w:type="dxa" w:w="80"/>
+              <w:top w:type="dxa" w:w="100"/>
+              <w:left w:type="dxa" w:w="85"/>
+              <w:bottom w:type="dxa" w:w="100"/>
+              <w:right w:type="dxa" w:w="85"/>
             </w:tcMar>
             <w:vAlign w:val="center"/>
           </w:tcPr>
           <w:p>
             <w:pPr>
-              <w:spacing w:after="60"/>
               <w:jc w:val="center"/>
             </w:pPr>
             <w:r>
               <w:drawing>
                 <wp:inline distT="0" distB="0" distL="0" distR="0">
-                  <wp:extent cx="2981325" cy="2238375"/>
+                  <wp:extent cx="2952750" cy="2209800"/>
                   <wp:effectExtent t="0" r="0" b="0" l="0"/>
                   <wp:docPr id="1" name="" descr="" title=""/>
                   <wp:cNvGraphicFramePr>
@@ -1603,7 +1584,7 @@
                         <pic:spPr bwMode="auto">
                           <a:xfrm>
                             <a:off x="0" y="0"/>
-                            <a:ext cx="2981325" cy="2238375"/>
+                            <a:ext cx="2952750" cy="2209800"/>
                           </a:xfrm>
                           <a:prstGeom prst="rect">
                             <a:avLst/>
@@ -1616,23 +1597,54 @@
               </w:drawing>
             </w:r>
           </w:p>
-          <w:p>
-            <w:pPr>
-              <w:jc w:val="center"/>
-            </w:pPr>
-            <w:r>
-              <w:rPr>
-                <w:rFonts w:ascii="Arial" w:cs="Arial" w:eastAsia="Arial" w:hAnsi="Arial"/>
-                <w:color w:val="595959"/>
-                <w:sz w:val="16"/>
-                <w:szCs w:val="16"/>
-              </w:rPr>
-              <w:t xml:space="preserve">Фото 2</w:t>
-            </w:r>
-          </w:p>
         </w:tc>
       </w:tr>
+    </w:tbl>
+    <w:p>
+      <w:r>
+        <w:br w:type="page"/>
+      </w:r>
+    </w:p>
+    <w:p>
+      <w:pPr>
+        <w:pBdr>
+          <w:bottom w:val="single" w:color="D0D7E5" w:sz="4"/>
+        </w:pBdr>
+        <w:spacing w:after="120" w:before="240"/>
+      </w:pPr>
+      <w:r>
+        <w:rPr>
+          <w:rFonts w:ascii="Arial" w:cs="Arial" w:eastAsia="Arial" w:hAnsi="Arial"/>
+          <w:b/>
+          <w:bCs/>
+          <w:color w:val="767676"/>
+          <w:spacing w:val="40"/>
+          <w:sz w:val="17"/>
+          <w:szCs w:val="17"/>
+        </w:rPr>
+        <w:t xml:space="preserve">ФОТО ОБЪЕКТА · 3–8 ИЗ 18</w:t>
+      </w:r>
+    </w:p>
+    <w:tbl>
+      <w:tblPr>
+        <w:tblW w:type="dxa" w:w="9638"/>
+        <w:tblBorders>
+          <w:top w:val="none" w:color="FFFFFF" w:sz="0"/>
+          <w:left w:val="none" w:color="FFFFFF" w:sz="0"/>
+          <w:bottom w:val="none" w:color="FFFFFF" w:sz="0"/>
+          <w:right w:val="none" w:color="FFFFFF" w:sz="0"/>
+          <w:insideH w:val="none" w:color="FFFFFF" w:sz="0"/>
+          <w:insideV w:val="none" w:color="FFFFFF" w:sz="0"/>
+        </w:tblBorders>
+      </w:tblPr>
+      <w:tblGrid>
+        <w:gridCol w:w="4819"/>
+        <w:gridCol w:w="4819"/>
+      </w:tblGrid>
       <w:tr>
+        <w:trPr>
+          <w:trHeight w:val="4650" w:hRule="exact"/>
+        </w:trPr>
         <w:tc>
           <w:tcPr>
             <w:tcW w:type="dxa" w:w="4819"/>
@@ -1643,22 +1655,21 @@
               <w:right w:val="none" w:color="FFFFFF" w:sz="0"/>
             </w:tcBorders>
             <w:tcMar>
-              <w:top w:type="dxa" w:w="120"/>
-              <w:left w:type="dxa" w:w="80"/>
-              <w:bottom w:type="dxa" w:w="120"/>
-              <w:right w:type="dxa" w:w="80"/>
+              <w:top w:type="dxa" w:w="100"/>
+              <w:left w:type="dxa" w:w="85"/>
+              <w:bottom w:type="dxa" w:w="100"/>
+              <w:right w:type="dxa" w:w="85"/>
             </w:tcMar>
             <w:vAlign w:val="center"/>
           </w:tcPr>
           <w:p>
             <w:pPr>
-              <w:spacing w:after="60"/>
               <w:jc w:val="center"/>
             </w:pPr>
             <w:r>
               <w:drawing>
                 <wp:inline distT="0" distB="0" distL="0" distR="0">
-                  <wp:extent cx="2981325" cy="2238375"/>
+                  <wp:extent cx="2952750" cy="2209800"/>
                   <wp:effectExtent t="0" r="0" b="0" l="0"/>
                   <wp:docPr id="1" name="" descr="" title=""/>
                   <wp:cNvGraphicFramePr>
@@ -1683,7 +1694,7 @@
                         <pic:spPr bwMode="auto">
                           <a:xfrm>
                             <a:off x="0" y="0"/>
-                            <a:ext cx="2981325" cy="2238375"/>
+                            <a:ext cx="2952750" cy="2209800"/>
                           </a:xfrm>
                           <a:prstGeom prst="rect">
                             <a:avLst/>
@@ -1696,20 +1707,6 @@
               </w:drawing>
             </w:r>
           </w:p>
-          <w:p>
-            <w:pPr>
-              <w:jc w:val="center"/>
-            </w:pPr>
-            <w:r>
-              <w:rPr>
-                <w:rFonts w:ascii="Arial" w:cs="Arial" w:eastAsia="Arial" w:hAnsi="Arial"/>
-                <w:color w:val="595959"/>
-                <w:sz w:val="16"/>
-                <w:szCs w:val="16"/>
-              </w:rPr>
-              <w:t xml:space="preserve">Фото 3</w:t>
-            </w:r>
-          </w:p>
         </w:tc>
         <w:tc>
           <w:tcPr>
@@ -1721,22 +1718,21 @@
               <w:right w:val="none" w:color="FFFFFF" w:sz="0"/>
             </w:tcBorders>
             <w:tcMar>
-              <w:top w:type="dxa" w:w="120"/>
-              <w:left w:type="dxa" w:w="80"/>
-              <w:bottom w:type="dxa" w:w="120"/>
-              <w:right w:type="dxa" w:w="80"/>
+              <w:top w:type="dxa" w:w="100"/>
+              <w:left w:type="dxa" w:w="85"/>
+              <w:bottom w:type="dxa" w:w="100"/>
+              <w:right w:type="dxa" w:w="85"/>
             </w:tcMar>
             <w:vAlign w:val="center"/>
           </w:tcPr>
           <w:p>
             <w:pPr>
-              <w:spacing w:after="60"/>
               <w:jc w:val="center"/>
             </w:pPr>
             <w:r>
               <w:drawing>
                 <wp:inline distT="0" distB="0" distL="0" distR="0">
-                  <wp:extent cx="2981325" cy="1933575"/>
+                  <wp:extent cx="2952750" cy="1914525"/>
                   <wp:effectExtent t="0" r="0" b="0" l="0"/>
                   <wp:docPr id="1" name="" descr="" title=""/>
                   <wp:cNvGraphicFramePr>
@@ -1761,7 +1757,7 @@
                         <pic:spPr bwMode="auto">
                           <a:xfrm>
                             <a:off x="0" y="0"/>
-                            <a:ext cx="2981325" cy="1933575"/>
+                            <a:ext cx="2952750" cy="1914525"/>
                           </a:xfrm>
                           <a:prstGeom prst="rect">
                             <a:avLst/>
@@ -1774,65 +1770,12 @@
               </w:drawing>
             </w:r>
           </w:p>
-          <w:p>
-            <w:pPr>
-              <w:jc w:val="center"/>
-            </w:pPr>
-            <w:r>
-              <w:rPr>
-                <w:rFonts w:ascii="Arial" w:cs="Arial" w:eastAsia="Arial" w:hAnsi="Arial"/>
-                <w:color w:val="595959"/>
-                <w:sz w:val="16"/>
-                <w:szCs w:val="16"/>
-              </w:rPr>
-              <w:t xml:space="preserve">Фото 4</w:t>
-            </w:r>
-          </w:p>
         </w:tc>
       </w:tr>
-    </w:tbl>
-    <w:p>
-      <w:r>
-        <w:br w:type="page"/>
-      </w:r>
-    </w:p>
-    <w:p>
-      <w:pPr>
-        <w:pBdr>
-          <w:bottom w:val="single" w:color="BFBFBF" w:sz="4"/>
-        </w:pBdr>
-        <w:spacing w:after="120" w:before="240"/>
-      </w:pPr>
-      <w:r>
-        <w:rPr>
-          <w:rFonts w:ascii="Arial" w:cs="Arial" w:eastAsia="Arial" w:hAnsi="Arial"/>
-          <w:b/>
-          <w:bCs/>
-          <w:color w:val="595959"/>
-          <w:spacing w:val="30"/>
-          <w:sz w:val="20"/>
-          <w:szCs w:val="20"/>
-        </w:rPr>
-        <w:t xml:space="preserve">ФОТО ОБЪЕКТА (5–8 ИЗ 18)</w:t>
-      </w:r>
-    </w:p>
-    <w:tbl>
-      <w:tblPr>
-        <w:tblW w:type="dxa" w:w="9638"/>
-        <w:tblBorders>
-          <w:top w:val="none" w:color="FFFFFF" w:sz="0"/>
-          <w:left w:val="none" w:color="FFFFFF" w:sz="0"/>
-          <w:bottom w:val="none" w:color="FFFFFF" w:sz="0"/>
-          <w:right w:val="none" w:color="FFFFFF" w:sz="0"/>
-          <w:insideH w:val="none" w:color="FFFFFF" w:sz="0"/>
-          <w:insideV w:val="none" w:color="FFFFFF" w:sz="0"/>
-        </w:tblBorders>
-      </w:tblPr>
-      <w:tblGrid>
-        <w:gridCol w:w="4819"/>
-        <w:gridCol w:w="4819"/>
-      </w:tblGrid>
       <w:tr>
+        <w:trPr>
+          <w:trHeight w:val="4650" w:hRule="exact"/>
+        </w:trPr>
         <w:tc>
           <w:tcPr>
             <w:tcW w:type="dxa" w:w="4819"/>
@@ -1843,22 +1786,21 @@
               <w:right w:val="none" w:color="FFFFFF" w:sz="0"/>
             </w:tcBorders>
             <w:tcMar>
-              <w:top w:type="dxa" w:w="120"/>
-              <w:left w:type="dxa" w:w="80"/>
-              <w:bottom w:type="dxa" w:w="120"/>
-              <w:right w:type="dxa" w:w="80"/>
+              <w:top w:type="dxa" w:w="100"/>
+              <w:left w:type="dxa" w:w="85"/>
+              <w:bottom w:type="dxa" w:w="100"/>
+              <w:right w:type="dxa" w:w="85"/>
             </w:tcMar>
             <w:vAlign w:val="center"/>
           </w:tcPr>
           <w:p>
             <w:pPr>
-              <w:spacing w:after="60"/>
               <w:jc w:val="center"/>
             </w:pPr>
             <w:r>
               <w:drawing>
                 <wp:inline distT="0" distB="0" distL="0" distR="0">
-                  <wp:extent cx="2981325" cy="2238375"/>
+                  <wp:extent cx="2952750" cy="2209800"/>
                   <wp:effectExtent t="0" r="0" b="0" l="0"/>
                   <wp:docPr id="1" name="" descr="" title=""/>
                   <wp:cNvGraphicFramePr>
@@ -1883,7 +1825,7 @@
                         <pic:spPr bwMode="auto">
                           <a:xfrm>
                             <a:off x="0" y="0"/>
-                            <a:ext cx="2981325" cy="2238375"/>
+                            <a:ext cx="2952750" cy="2209800"/>
                           </a:xfrm>
                           <a:prstGeom prst="rect">
                             <a:avLst/>
@@ -1896,20 +1838,6 @@
               </w:drawing>
             </w:r>
           </w:p>
-          <w:p>
-            <w:pPr>
-              <w:jc w:val="center"/>
-            </w:pPr>
-            <w:r>
-              <w:rPr>
-                <w:rFonts w:ascii="Arial" w:cs="Arial" w:eastAsia="Arial" w:hAnsi="Arial"/>
-                <w:color w:val="595959"/>
-                <w:sz w:val="16"/>
-                <w:szCs w:val="16"/>
-              </w:rPr>
-              <w:t xml:space="preserve">Фото 5</w:t>
-            </w:r>
-          </w:p>
         </w:tc>
         <w:tc>
           <w:tcPr>
@@ -1921,22 +1849,21 @@
               <w:right w:val="none" w:color="FFFFFF" w:sz="0"/>
             </w:tcBorders>
             <w:tcMar>
-              <w:top w:type="dxa" w:w="120"/>
-              <w:left w:type="dxa" w:w="80"/>
-              <w:bottom w:type="dxa" w:w="120"/>
-              <w:right w:type="dxa" w:w="80"/>
+              <w:top w:type="dxa" w:w="100"/>
+              <w:left w:type="dxa" w:w="85"/>
+              <w:bottom w:type="dxa" w:w="100"/>
+              <w:right w:type="dxa" w:w="85"/>
             </w:tcMar>
             <w:vAlign w:val="center"/>
           </w:tcPr>
           <w:p>
             <w:pPr>
-              <w:spacing w:after="60"/>
               <w:jc w:val="center"/>
             </w:pPr>
             <w:r>
               <w:drawing>
                 <wp:inline distT="0" distB="0" distL="0" distR="0">
-                  <wp:extent cx="2981325" cy="2238375"/>
+                  <wp:extent cx="2952750" cy="2209800"/>
                   <wp:effectExtent t="0" r="0" b="0" l="0"/>
                   <wp:docPr id="1" name="" descr="" title=""/>
                   <wp:cNvGraphicFramePr>
@@ -1961,7 +1888,7 @@
                         <pic:spPr bwMode="auto">
                           <a:xfrm>
                             <a:off x="0" y="0"/>
-                            <a:ext cx="2981325" cy="2238375"/>
+                            <a:ext cx="2952750" cy="2209800"/>
                           </a:xfrm>
                           <a:prstGeom prst="rect">
                             <a:avLst/>
@@ -1974,23 +1901,12 @@
               </w:drawing>
             </w:r>
           </w:p>
-          <w:p>
-            <w:pPr>
-              <w:jc w:val="center"/>
-            </w:pPr>
-            <w:r>
-              <w:rPr>
-                <w:rFonts w:ascii="Arial" w:cs="Arial" w:eastAsia="Arial" w:hAnsi="Arial"/>
-                <w:color w:val="595959"/>
-                <w:sz w:val="16"/>
-                <w:szCs w:val="16"/>
-              </w:rPr>
-              <w:t xml:space="preserve">Фото 6</w:t>
-            </w:r>
-          </w:p>
         </w:tc>
       </w:tr>
       <w:tr>
+        <w:trPr>
+          <w:trHeight w:val="4650" w:hRule="exact"/>
+        </w:trPr>
         <w:tc>
           <w:tcPr>
             <w:tcW w:type="dxa" w:w="4819"/>
@@ -2001,22 +1917,21 @@
               <w:right w:val="none" w:color="FFFFFF" w:sz="0"/>
             </w:tcBorders>
             <w:tcMar>
-              <w:top w:type="dxa" w:w="120"/>
-              <w:left w:type="dxa" w:w="80"/>
-              <w:bottom w:type="dxa" w:w="120"/>
-              <w:right w:type="dxa" w:w="80"/>
+              <w:top w:type="dxa" w:w="100"/>
+              <w:left w:type="dxa" w:w="85"/>
+              <w:bottom w:type="dxa" w:w="100"/>
+              <w:right w:type="dxa" w:w="85"/>
             </w:tcMar>
             <w:vAlign w:val="center"/>
           </w:tcPr>
           <w:p>
             <w:pPr>
-              <w:spacing w:after="60"/>
               <w:jc w:val="center"/>
             </w:pPr>
             <w:r>
               <w:drawing>
                 <wp:inline distT="0" distB="0" distL="0" distR="0">
-                  <wp:extent cx="2981325" cy="2238375"/>
+                  <wp:extent cx="2952750" cy="2209800"/>
                   <wp:effectExtent t="0" r="0" b="0" l="0"/>
                   <wp:docPr id="1" name="" descr="" title=""/>
                   <wp:cNvGraphicFramePr>
@@ -2041,7 +1956,7 @@
                         <pic:spPr bwMode="auto">
                           <a:xfrm>
                             <a:off x="0" y="0"/>
-                            <a:ext cx="2981325" cy="2238375"/>
+                            <a:ext cx="2952750" cy="2209800"/>
                           </a:xfrm>
                           <a:prstGeom prst="rect">
                             <a:avLst/>
@@ -2054,20 +1969,6 @@
               </w:drawing>
             </w:r>
           </w:p>
-          <w:p>
-            <w:pPr>
-              <w:jc w:val="center"/>
-            </w:pPr>
-            <w:r>
-              <w:rPr>
-                <w:rFonts w:ascii="Arial" w:cs="Arial" w:eastAsia="Arial" w:hAnsi="Arial"/>
-                <w:color w:val="595959"/>
-                <w:sz w:val="16"/>
-                <w:szCs w:val="16"/>
-              </w:rPr>
-              <w:t xml:space="preserve">Фото 7</w:t>
-            </w:r>
-          </w:p>
         </w:tc>
         <w:tc>
           <w:tcPr>
@@ -2079,22 +1980,21 @@
               <w:right w:val="none" w:color="FFFFFF" w:sz="0"/>
             </w:tcBorders>
             <w:tcMar>
-              <w:top w:type="dxa" w:w="120"/>
-              <w:left w:type="dxa" w:w="80"/>
-              <w:bottom w:type="dxa" w:w="120"/>
-              <w:right w:type="dxa" w:w="80"/>
+              <w:top w:type="dxa" w:w="100"/>
+              <w:left w:type="dxa" w:w="85"/>
+              <w:bottom w:type="dxa" w:w="100"/>
+              <w:right w:type="dxa" w:w="85"/>
             </w:tcMar>
             <w:vAlign w:val="center"/>
           </w:tcPr>
           <w:p>
             <w:pPr>
-              <w:spacing w:after="60"/>
               <w:jc w:val="center"/>
             </w:pPr>
             <w:r>
               <w:drawing>
                 <wp:inline distT="0" distB="0" distL="0" distR="0">
-                  <wp:extent cx="2981325" cy="2238375"/>
+                  <wp:extent cx="2952750" cy="2209800"/>
                   <wp:effectExtent t="0" r="0" b="0" l="0"/>
                   <wp:docPr id="1" name="" descr="" title=""/>
                   <wp:cNvGraphicFramePr>
@@ -2119,7 +2019,7 @@
                         <pic:spPr bwMode="auto">
                           <a:xfrm>
                             <a:off x="0" y="0"/>
-                            <a:ext cx="2981325" cy="2238375"/>
+                            <a:ext cx="2952750" cy="2209800"/>
                           </a:xfrm>
                           <a:prstGeom prst="rect">
                             <a:avLst/>
@@ -2132,20 +2032,6 @@
               </w:drawing>
             </w:r>
           </w:p>
-          <w:p>
-            <w:pPr>
-              <w:jc w:val="center"/>
-            </w:pPr>
-            <w:r>
-              <w:rPr>
-                <w:rFonts w:ascii="Arial" w:cs="Arial" w:eastAsia="Arial" w:hAnsi="Arial"/>
-                <w:color w:val="595959"/>
-                <w:sz w:val="16"/>
-                <w:szCs w:val="16"/>
-              </w:rPr>
-              <w:t xml:space="preserve">Фото 8</w:t>
-            </w:r>
-          </w:p>
         </w:tc>
       </w:tr>
     </w:tbl>
@@ -2157,7 +2043,7 @@
     <w:p>
       <w:pPr>
         <w:pBdr>
-          <w:bottom w:val="single" w:color="BFBFBF" w:sz="4"/>
+          <w:bottom w:val="single" w:color="D0D7E5" w:sz="4"/>
         </w:pBdr>
         <w:spacing w:after="120" w:before="240"/>
       </w:pPr>
@@ -2166,12 +2052,12 @@
           <w:rFonts w:ascii="Arial" w:cs="Arial" w:eastAsia="Arial" w:hAnsi="Arial"/>
           <w:b/>
           <w:bCs/>
-          <w:color w:val="595959"/>
-          <w:spacing w:val="30"/>
-          <w:sz w:val="20"/>
-          <w:szCs w:val="20"/>
+          <w:color w:val="767676"/>
+          <w:spacing w:val="40"/>
+          <w:sz w:val="17"/>
+          <w:szCs w:val="17"/>
         </w:rPr>
-        <w:t xml:space="preserve">ФОТО ОБЪЕКТА (9–12 ИЗ 18)</w:t>
+        <w:t xml:space="preserve">ФОТО ОБЪЕКТА · 9–13 ИЗ 18</w:t>
       </w:r>
     </w:p>
     <w:tbl>
@@ -2191,6 +2077,9 @@
         <w:gridCol w:w="4819"/>
       </w:tblGrid>
       <w:tr>
+        <w:trPr>
+          <w:trHeight w:val="4650" w:hRule="exact"/>
+        </w:trPr>
         <w:tc>
           <w:tcPr>
             <w:tcW w:type="dxa" w:w="4819"/>
@@ -2201,22 +2090,21 @@
               <w:right w:val="none" w:color="FFFFFF" w:sz="0"/>
             </w:tcBorders>
             <w:tcMar>
-              <w:top w:type="dxa" w:w="120"/>
-              <w:left w:type="dxa" w:w="80"/>
-              <w:bottom w:type="dxa" w:w="120"/>
-              <w:right w:type="dxa" w:w="80"/>
+              <w:top w:type="dxa" w:w="100"/>
+              <w:left w:type="dxa" w:w="85"/>
+              <w:bottom w:type="dxa" w:w="100"/>
+              <w:right w:type="dxa" w:w="85"/>
             </w:tcMar>
             <w:vAlign w:val="center"/>
           </w:tcPr>
           <w:p>
             <w:pPr>
-              <w:spacing w:after="60"/>
               <w:jc w:val="center"/>
             </w:pPr>
             <w:r>
               <w:drawing>
                 <wp:inline distT="0" distB="0" distL="0" distR="0">
-                  <wp:extent cx="2981325" cy="2238375"/>
+                  <wp:extent cx="2952750" cy="2209800"/>
                   <wp:effectExtent t="0" r="0" b="0" l="0"/>
                   <wp:docPr id="1" name="" descr="" title=""/>
                   <wp:cNvGraphicFramePr>
@@ -2241,7 +2129,7 @@
                         <pic:spPr bwMode="auto">
                           <a:xfrm>
                             <a:off x="0" y="0"/>
-                            <a:ext cx="2981325" cy="2238375"/>
+                            <a:ext cx="2952750" cy="2209800"/>
                           </a:xfrm>
                           <a:prstGeom prst="rect">
                             <a:avLst/>
@@ -2254,20 +2142,6 @@
               </w:drawing>
             </w:r>
           </w:p>
-          <w:p>
-            <w:pPr>
-              <w:jc w:val="center"/>
-            </w:pPr>
-            <w:r>
-              <w:rPr>
-                <w:rFonts w:ascii="Arial" w:cs="Arial" w:eastAsia="Arial" w:hAnsi="Arial"/>
-                <w:color w:val="595959"/>
-                <w:sz w:val="16"/>
-                <w:szCs w:val="16"/>
-              </w:rPr>
-              <w:t xml:space="preserve">Фото 9</w:t>
-            </w:r>
-          </w:p>
         </w:tc>
         <w:tc>
           <w:tcPr>
@@ -2279,22 +2153,21 @@
               <w:right w:val="none" w:color="FFFFFF" w:sz="0"/>
             </w:tcBorders>
             <w:tcMar>
-              <w:top w:type="dxa" w:w="120"/>
-              <w:left w:type="dxa" w:w="80"/>
-              <w:bottom w:type="dxa" w:w="120"/>
-              <w:right w:type="dxa" w:w="80"/>
+              <w:top w:type="dxa" w:w="100"/>
+              <w:left w:type="dxa" w:w="85"/>
+              <w:bottom w:type="dxa" w:w="100"/>
+              <w:right w:type="dxa" w:w="85"/>
             </w:tcMar>
             <w:vAlign w:val="center"/>
           </w:tcPr>
           <w:p>
             <w:pPr>
-              <w:spacing w:after="60"/>
               <w:jc w:val="center"/>
             </w:pPr>
             <w:r>
               <w:drawing>
                 <wp:inline distT="0" distB="0" distL="0" distR="0">
-                  <wp:extent cx="2981325" cy="2238375"/>
+                  <wp:extent cx="2952750" cy="2209800"/>
                   <wp:effectExtent t="0" r="0" b="0" l="0"/>
                   <wp:docPr id="1" name="" descr="" title=""/>
                   <wp:cNvGraphicFramePr>
@@ -2319,7 +2192,7 @@
                         <pic:spPr bwMode="auto">
                           <a:xfrm>
                             <a:off x="0" y="0"/>
-                            <a:ext cx="2981325" cy="2238375"/>
+                            <a:ext cx="2952750" cy="2209800"/>
                           </a:xfrm>
                           <a:prstGeom prst="rect">
                             <a:avLst/>
@@ -2332,23 +2205,12 @@
               </w:drawing>
             </w:r>
           </w:p>
-          <w:p>
-            <w:pPr>
-              <w:jc w:val="center"/>
-            </w:pPr>
-            <w:r>
-              <w:rPr>
-                <w:rFonts w:ascii="Arial" w:cs="Arial" w:eastAsia="Arial" w:hAnsi="Arial"/>
-                <w:color w:val="595959"/>
-                <w:sz w:val="16"/>
-                <w:szCs w:val="16"/>
-              </w:rPr>
-              <w:t xml:space="preserve">Фото 10</w:t>
-            </w:r>
-          </w:p>
         </w:tc>
       </w:tr>
       <w:tr>
+        <w:trPr>
+          <w:trHeight w:val="4650" w:hRule="exact"/>
+        </w:trPr>
         <w:tc>
           <w:tcPr>
             <w:tcW w:type="dxa" w:w="4819"/>
@@ -2359,22 +2221,21 @@
               <w:right w:val="none" w:color="FFFFFF" w:sz="0"/>
             </w:tcBorders>
             <w:tcMar>
-              <w:top w:type="dxa" w:w="120"/>
-              <w:left w:type="dxa" w:w="80"/>
-              <w:bottom w:type="dxa" w:w="120"/>
-              <w:right w:type="dxa" w:w="80"/>
+              <w:top w:type="dxa" w:w="100"/>
+              <w:left w:type="dxa" w:w="85"/>
+              <w:bottom w:type="dxa" w:w="100"/>
+              <w:right w:type="dxa" w:w="85"/>
             </w:tcMar>
             <w:vAlign w:val="center"/>
           </w:tcPr>
           <w:p>
             <w:pPr>
-              <w:spacing w:after="60"/>
               <w:jc w:val="center"/>
             </w:pPr>
             <w:r>
               <w:drawing>
                 <wp:inline distT="0" distB="0" distL="0" distR="0">
-                  <wp:extent cx="2981325" cy="2238375"/>
+                  <wp:extent cx="2952750" cy="2209800"/>
                   <wp:effectExtent t="0" r="0" b="0" l="0"/>
                   <wp:docPr id="1" name="" descr="" title=""/>
                   <wp:cNvGraphicFramePr>
@@ -2399,7 +2260,7 @@
                         <pic:spPr bwMode="auto">
                           <a:xfrm>
                             <a:off x="0" y="0"/>
-                            <a:ext cx="2981325" cy="2238375"/>
+                            <a:ext cx="2952750" cy="2209800"/>
                           </a:xfrm>
                           <a:prstGeom prst="rect">
                             <a:avLst/>
@@ -2412,20 +2273,6 @@
               </w:drawing>
             </w:r>
           </w:p>
-          <w:p>
-            <w:pPr>
-              <w:jc w:val="center"/>
-            </w:pPr>
-            <w:r>
-              <w:rPr>
-                <w:rFonts w:ascii="Arial" w:cs="Arial" w:eastAsia="Arial" w:hAnsi="Arial"/>
-                <w:color w:val="595959"/>
-                <w:sz w:val="16"/>
-                <w:szCs w:val="16"/>
-              </w:rPr>
-              <w:t xml:space="preserve">Фото 11</w:t>
-            </w:r>
-          </w:p>
         </w:tc>
         <w:tc>
           <w:tcPr>
@@ -2437,22 +2284,21 @@
               <w:right w:val="none" w:color="FFFFFF" w:sz="0"/>
             </w:tcBorders>
             <w:tcMar>
-              <w:top w:type="dxa" w:w="120"/>
-              <w:left w:type="dxa" w:w="80"/>
-              <w:bottom w:type="dxa" w:w="120"/>
-              <w:right w:type="dxa" w:w="80"/>
+              <w:top w:type="dxa" w:w="100"/>
+              <w:left w:type="dxa" w:w="85"/>
+              <w:bottom w:type="dxa" w:w="100"/>
+              <w:right w:type="dxa" w:w="85"/>
             </w:tcMar>
             <w:vAlign w:val="center"/>
           </w:tcPr>
           <w:p>
             <w:pPr>
-              <w:spacing w:after="60"/>
               <w:jc w:val="center"/>
             </w:pPr>
             <w:r>
               <w:drawing>
                 <wp:inline distT="0" distB="0" distL="0" distR="0">
-                  <wp:extent cx="2981325" cy="2238375"/>
+                  <wp:extent cx="2952750" cy="2209800"/>
                   <wp:effectExtent t="0" r="0" b="0" l="0"/>
                   <wp:docPr id="1" name="" descr="" title=""/>
                   <wp:cNvGraphicFramePr>
@@ -2477,7 +2323,7 @@
                         <pic:spPr bwMode="auto">
                           <a:xfrm>
                             <a:off x="0" y="0"/>
-                            <a:ext cx="2981325" cy="2238375"/>
+                            <a:ext cx="2952750" cy="2209800"/>
                           </a:xfrm>
                           <a:prstGeom prst="rect">
                             <a:avLst/>
@@ -2490,65 +2336,12 @@
               </w:drawing>
             </w:r>
           </w:p>
-          <w:p>
-            <w:pPr>
-              <w:jc w:val="center"/>
-            </w:pPr>
-            <w:r>
-              <w:rPr>
-                <w:rFonts w:ascii="Arial" w:cs="Arial" w:eastAsia="Arial" w:hAnsi="Arial"/>
-                <w:color w:val="595959"/>
-                <w:sz w:val="16"/>
-                <w:szCs w:val="16"/>
-              </w:rPr>
-              <w:t xml:space="preserve">Фото 12</w:t>
-            </w:r>
-          </w:p>
         </w:tc>
       </w:tr>
-    </w:tbl>
-    <w:p>
-      <w:r>
-        <w:br w:type="page"/>
-      </w:r>
-    </w:p>
-    <w:p>
-      <w:pPr>
-        <w:pBdr>
-          <w:bottom w:val="single" w:color="BFBFBF" w:sz="4"/>
-        </w:pBdr>
-        <w:spacing w:after="120" w:before="240"/>
-      </w:pPr>
-      <w:r>
-        <w:rPr>
-          <w:rFonts w:ascii="Arial" w:cs="Arial" w:eastAsia="Arial" w:hAnsi="Arial"/>
-          <w:b/>
-          <w:bCs/>
-          <w:color w:val="595959"/>
-          <w:spacing w:val="30"/>
-          <w:sz w:val="20"/>
-          <w:szCs w:val="20"/>
-        </w:rPr>
-        <w:t xml:space="preserve">ФОТО ОБЪЕКТА (13–16 ИЗ 18)</w:t>
-      </w:r>
-    </w:p>
-    <w:tbl>
-      <w:tblPr>
-        <w:tblW w:type="dxa" w:w="9638"/>
-        <w:tblBorders>
-          <w:top w:val="none" w:color="FFFFFF" w:sz="0"/>
-          <w:left w:val="none" w:color="FFFFFF" w:sz="0"/>
-          <w:bottom w:val="none" w:color="FFFFFF" w:sz="0"/>
-          <w:right w:val="none" w:color="FFFFFF" w:sz="0"/>
-          <w:insideH w:val="none" w:color="FFFFFF" w:sz="0"/>
-          <w:insideV w:val="none" w:color="FFFFFF" w:sz="0"/>
-        </w:tblBorders>
-      </w:tblPr>
-      <w:tblGrid>
-        <w:gridCol w:w="4819"/>
-        <w:gridCol w:w="4819"/>
-      </w:tblGrid>
       <w:tr>
+        <w:trPr>
+          <w:trHeight w:val="4650" w:hRule="exact"/>
+        </w:trPr>
         <w:tc>
           <w:tcPr>
             <w:tcW w:type="dxa" w:w="4819"/>
@@ -2559,22 +2352,21 @@
               <w:right w:val="none" w:color="FFFFFF" w:sz="0"/>
             </w:tcBorders>
             <w:tcMar>
-              <w:top w:type="dxa" w:w="120"/>
-              <w:left w:type="dxa" w:w="80"/>
-              <w:bottom w:type="dxa" w:w="120"/>
-              <w:right w:type="dxa" w:w="80"/>
+              <w:top w:type="dxa" w:w="100"/>
+              <w:left w:type="dxa" w:w="85"/>
+              <w:bottom w:type="dxa" w:w="100"/>
+              <w:right w:type="dxa" w:w="85"/>
             </w:tcMar>
             <w:vAlign w:val="center"/>
           </w:tcPr>
           <w:p>
             <w:pPr>
-              <w:spacing w:after="60"/>
               <w:jc w:val="center"/>
             </w:pPr>
             <w:r>
               <w:drawing>
                 <wp:inline distT="0" distB="0" distL="0" distR="0">
-                  <wp:extent cx="2981325" cy="2238375"/>
+                  <wp:extent cx="2952750" cy="2209800"/>
                   <wp:effectExtent t="0" r="0" b="0" l="0"/>
                   <wp:docPr id="1" name="" descr="" title=""/>
                   <wp:cNvGraphicFramePr>
@@ -2599,7 +2391,7 @@
                         <pic:spPr bwMode="auto">
                           <a:xfrm>
                             <a:off x="0" y="0"/>
-                            <a:ext cx="2981325" cy="2238375"/>
+                            <a:ext cx="2952750" cy="2209800"/>
                           </a:xfrm>
                           <a:prstGeom prst="rect">
                             <a:avLst/>
@@ -2612,20 +2404,6 @@
               </w:drawing>
             </w:r>
           </w:p>
-          <w:p>
-            <w:pPr>
-              <w:jc w:val="center"/>
-            </w:pPr>
-            <w:r>
-              <w:rPr>
-                <w:rFonts w:ascii="Arial" w:cs="Arial" w:eastAsia="Arial" w:hAnsi="Arial"/>
-                <w:color w:val="595959"/>
-                <w:sz w:val="16"/>
-                <w:szCs w:val="16"/>
-              </w:rPr>
-              <w:t xml:space="preserve">Фото 13</w:t>
-            </w:r>
-          </w:p>
         </w:tc>
         <w:tc>
           <w:tcPr>
@@ -2637,22 +2415,97 @@
               <w:right w:val="none" w:color="FFFFFF" w:sz="0"/>
             </w:tcBorders>
             <w:tcMar>
-              <w:top w:type="dxa" w:w="120"/>
-              <w:left w:type="dxa" w:w="80"/>
-              <w:bottom w:type="dxa" w:w="120"/>
-              <w:right w:type="dxa" w:w="80"/>
+              <w:top w:type="dxa" w:w="100"/>
+              <w:left w:type="dxa" w:w="85"/>
+              <w:bottom w:type="dxa" w:w="100"/>
+              <w:right w:type="dxa" w:w="85"/>
             </w:tcMar>
             <w:vAlign w:val="center"/>
           </w:tcPr>
           <w:p>
             <w:pPr>
-              <w:spacing w:after="60"/>
               <w:jc w:val="center"/>
             </w:pPr>
             <w:r>
+              <w:rPr>
+                <w:rFonts w:ascii="Arial" w:cs="Arial" w:eastAsia="Arial" w:hAnsi="Arial"/>
+              </w:rPr>
+              <w:t xml:space="preserve"/>
+            </w:r>
+          </w:p>
+        </w:tc>
+      </w:tr>
+    </w:tbl>
+    <w:p>
+      <w:r>
+        <w:br w:type="page"/>
+      </w:r>
+    </w:p>
+    <w:p>
+      <w:pPr>
+        <w:pBdr>
+          <w:bottom w:val="single" w:color="D0D7E5" w:sz="4"/>
+        </w:pBdr>
+        <w:spacing w:after="120" w:before="240"/>
+      </w:pPr>
+      <w:r>
+        <w:rPr>
+          <w:rFonts w:ascii="Arial" w:cs="Arial" w:eastAsia="Arial" w:hAnsi="Arial"/>
+          <w:b/>
+          <w:bCs/>
+          <w:color w:val="767676"/>
+          <w:spacing w:val="40"/>
+          <w:sz w:val="17"/>
+          <w:szCs w:val="17"/>
+        </w:rPr>
+        <w:t xml:space="preserve">ФОТО ОБЪЕКТА · 14–18 ИЗ 18</w:t>
+      </w:r>
+    </w:p>
+    <w:tbl>
+      <w:tblPr>
+        <w:tblW w:type="dxa" w:w="9638"/>
+        <w:tblBorders>
+          <w:top w:val="none" w:color="FFFFFF" w:sz="0"/>
+          <w:left w:val="none" w:color="FFFFFF" w:sz="0"/>
+          <w:bottom w:val="none" w:color="FFFFFF" w:sz="0"/>
+          <w:right w:val="none" w:color="FFFFFF" w:sz="0"/>
+          <w:insideH w:val="none" w:color="FFFFFF" w:sz="0"/>
+          <w:insideV w:val="none" w:color="FFFFFF" w:sz="0"/>
+        </w:tblBorders>
+      </w:tblPr>
+      <w:tblGrid>
+        <w:gridCol w:w="4819"/>
+        <w:gridCol w:w="4819"/>
+      </w:tblGrid>
+      <w:tr>
+        <w:trPr>
+          <w:trHeight w:val="4650" w:hRule="exact"/>
+        </w:trPr>
+        <w:tc>
+          <w:tcPr>
+            <w:tcW w:type="dxa" w:w="4819"/>
+            <w:tcBorders>
+              <w:top w:val="none" w:color="FFFFFF" w:sz="0"/>
+              <w:left w:val="none" w:color="FFFFFF" w:sz="0"/>
+              <w:bottom w:val="none" w:color="FFFFFF" w:sz="0"/>
+              <w:right w:val="none" w:color="FFFFFF" w:sz="0"/>
+            </w:tcBorders>
+            <w:tcMar>
+              <w:top w:type="dxa" w:w="100"/>
+              <w:left w:type="dxa" w:w="85"/>
+              <w:bottom w:type="dxa" w:w="100"/>
+              <w:right w:type="dxa" w:w="85"/>
+            </w:tcMar>
+            <w:vAlign w:val="center"/>
+          </w:tcPr>
+          <w:p>
+            <w:pPr>
+              <w:jc w:val="center"/>
+            </w:pPr>
+            <w:r>
               <w:drawing>
                 <wp:inline distT="0" distB="0" distL="0" distR="0">
-                  <wp:extent cx="2981325" cy="2238375"/>
+                  <wp:extent cx="2952750" cy="2209800"/>
                   <wp:effectExtent t="0" r="0" b="0" l="0"/>
                   <wp:docPr id="1" name="" descr="" title=""/>
                   <wp:cNvGraphicFramePr>
@@ -2677,7 +2530,7 @@
                         <pic:spPr bwMode="auto">
                           <a:xfrm>
                             <a:off x="0" y="0"/>
-                            <a:ext cx="2981325" cy="2238375"/>
+                            <a:ext cx="2952750" cy="2209800"/>
                           </a:xfrm>
                           <a:prstGeom prst="rect">
                             <a:avLst/>
@@ -2690,23 +2543,7 @@
               </w:drawing>
             </w:r>
           </w:p>
-          <w:p>
-            <w:pPr>
-              <w:jc w:val="center"/>
-            </w:pPr>
-            <w:r>
-              <w:rPr>
-                <w:rFonts w:ascii="Arial" w:cs="Arial" w:eastAsia="Arial" w:hAnsi="Arial"/>
-                <w:color w:val="595959"/>
-                <w:sz w:val="16"/>
-                <w:szCs w:val="16"/>
-              </w:rPr>
-              <w:t xml:space="preserve">Фото 14</w:t>
-            </w:r>
-          </w:p>
-        </w:tc>
-      </w:tr>
-      <w:tr>
+        </w:tc>
         <w:tc>
           <w:tcPr>
             <w:tcW w:type="dxa" w:w="4819"/>
@@ -2717,22 +2554,21 @@
               <w:right w:val="none" w:color="FFFFFF" w:sz="0"/>
             </w:tcBorders>
             <w:tcMar>
-              <w:top w:type="dxa" w:w="120"/>
-              <w:left w:type="dxa" w:w="80"/>
-              <w:bottom w:type="dxa" w:w="120"/>
-              <w:right w:type="dxa" w:w="80"/>
+              <w:top w:type="dxa" w:w="100"/>
+              <w:left w:type="dxa" w:w="85"/>
+              <w:bottom w:type="dxa" w:w="100"/>
+              <w:right w:type="dxa" w:w="85"/>
             </w:tcMar>
             <w:vAlign w:val="center"/>
           </w:tcPr>
           <w:p>
             <w:pPr>
-              <w:spacing w:after="60"/>
               <w:jc w:val="center"/>
             </w:pPr>
             <w:r>
               <w:drawing>
                 <wp:inline distT="0" distB="0" distL="0" distR="0">
-                  <wp:extent cx="2981325" cy="2238375"/>
+                  <wp:extent cx="2952750" cy="2209800"/>
                   <wp:effectExtent t="0" r="0" b="0" l="0"/>
                   <wp:docPr id="1" name="" descr="" title=""/>
                   <wp:cNvGraphicFramePr>
@@ -2757,7 +2593,7 @@
                         <pic:spPr bwMode="auto">
                           <a:xfrm>
                             <a:off x="0" y="0"/>
-                            <a:ext cx="2981325" cy="2238375"/>
+                            <a:ext cx="2952750" cy="2209800"/>
                           </a:xfrm>
                           <a:prstGeom prst="rect">
                             <a:avLst/>
@@ -2770,21 +2606,12 @@
               </w:drawing>
             </w:r>
           </w:p>
-          <w:p>
-            <w:pPr>
-              <w:jc w:val="center"/>
-            </w:pPr>
-            <w:r>
-              <w:rPr>
-                <w:rFonts w:ascii="Arial" w:cs="Arial" w:eastAsia="Arial" w:hAnsi="Arial"/>
-                <w:color w:val="595959"/>
-                <w:sz w:val="16"/>
-                <w:szCs w:val="16"/>
-              </w:rPr>
-              <w:t xml:space="preserve">Фото 15</w:t>
-            </w:r>
-          </w:p>
-        </w:tc>
+        </w:tc>
+      </w:tr>
+      <w:tr>
+        <w:trPr>
+          <w:trHeight w:val="4650" w:hRule="exact"/>
+        </w:trPr>
         <w:tc>
           <w:tcPr>
             <w:tcW w:type="dxa" w:w="4819"/>
@@ -2795,22 +2622,21 @@
               <w:right w:val="none" w:color="FFFFFF" w:sz="0"/>
             </w:tcBorders>
             <w:tcMar>
-              <w:top w:type="dxa" w:w="120"/>
-              <w:left w:type="dxa" w:w="80"/>
-              <w:bottom w:type="dxa" w:w="120"/>
-              <w:right w:type="dxa" w:w="80"/>
+              <w:top w:type="dxa" w:w="100"/>
+              <w:left w:type="dxa" w:w="85"/>
+              <w:bottom w:type="dxa" w:w="100"/>
+              <w:right w:type="dxa" w:w="85"/>
             </w:tcMar>
             <w:vAlign w:val="center"/>
           </w:tcPr>
           <w:p>
             <w:pPr>
-              <w:spacing w:after="60"/>
               <w:jc w:val="center"/>
             </w:pPr>
             <w:r>
               <w:drawing>
                 <wp:inline distT="0" distB="0" distL="0" distR="0">
-                  <wp:extent cx="2981325" cy="2238375"/>
+                  <wp:extent cx="2952750" cy="2209800"/>
                   <wp:effectExtent t="0" r="0" b="0" l="0"/>
                   <wp:docPr id="1" name="" descr="" title=""/>
                   <wp:cNvGraphicFramePr>
@@ -2835,7 +2661,7 @@
                         <pic:spPr bwMode="auto">
                           <a:xfrm>
                             <a:off x="0" y="0"/>
-                            <a:ext cx="2981325" cy="2238375"/>
+                            <a:ext cx="2952750" cy="2209800"/>
                           </a:xfrm>
                           <a:prstGeom prst="rect">
                             <a:avLst/>
@@ -2848,65 +2674,7 @@
               </w:drawing>
             </w:r>
           </w:p>
-          <w:p>
-            <w:pPr>
-              <w:jc w:val="center"/>
-            </w:pPr>
-            <w:r>
-              <w:rPr>
-                <w:rFonts w:ascii="Arial" w:cs="Arial" w:eastAsia="Arial" w:hAnsi="Arial"/>
-                <w:color w:val="595959"/>
-                <w:sz w:val="16"/>
-                <w:szCs w:val="16"/>
-              </w:rPr>
-              <w:t xml:space="preserve">Фото 16</w:t>
-            </w:r>
-          </w:p>
-        </w:tc>
-      </w:tr>
-    </w:tbl>
-    <w:p>
-      <w:r>
-        <w:br w:type="page"/>
-      </w:r>
-    </w:p>
-    <w:p>
-      <w:pPr>
-        <w:pBdr>
-          <w:bottom w:val="single" w:color="BFBFBF" w:sz="4"/>
-        </w:pBdr>
-        <w:spacing w:after="120" w:before="240"/>
-      </w:pPr>
-      <w:r>
-        <w:rPr>
-          <w:rFonts w:ascii="Arial" w:cs="Arial" w:eastAsia="Arial" w:hAnsi="Arial"/>
-          <w:b/>
-          <w:bCs/>
-          <w:color w:val="595959"/>
-          <w:spacing w:val="30"/>
-          <w:sz w:val="20"/>
-          <w:szCs w:val="20"/>
-        </w:rPr>
-        <w:t xml:space="preserve">ФОТО ОБЪЕКТА (17–18 ИЗ 18)</w:t>
-      </w:r>
-    </w:p>
-    <w:tbl>
-      <w:tblPr>
-        <w:tblW w:type="dxa" w:w="9638"/>
-        <w:tblBorders>
-          <w:top w:val="none" w:color="FFFFFF" w:sz="0"/>
-          <w:left w:val="none" w:color="FFFFFF" w:sz="0"/>
-          <w:bottom w:val="none" w:color="FFFFFF" w:sz="0"/>
-          <w:right w:val="none" w:color="FFFFFF" w:sz="0"/>
-          <w:insideH w:val="none" w:color="FFFFFF" w:sz="0"/>
-          <w:insideV w:val="none" w:color="FFFFFF" w:sz="0"/>
-        </w:tblBorders>
-      </w:tblPr>
-      <w:tblGrid>
-        <w:gridCol w:w="4819"/>
-        <w:gridCol w:w="4819"/>
-      </w:tblGrid>
-      <w:tr>
+        </w:tc>
         <w:tc>
           <w:tcPr>
             <w:tcW w:type="dxa" w:w="4819"/>
@@ -2917,22 +2685,21 @@
               <w:right w:val="none" w:color="FFFFFF" w:sz="0"/>
             </w:tcBorders>
             <w:tcMar>
-              <w:top w:type="dxa" w:w="120"/>
-              <w:left w:type="dxa" w:w="80"/>
-              <w:bottom w:type="dxa" w:w="120"/>
-              <w:right w:type="dxa" w:w="80"/>
+              <w:top w:type="dxa" w:w="100"/>
+              <w:left w:type="dxa" w:w="85"/>
+              <w:bottom w:type="dxa" w:w="100"/>
+              <w:right w:type="dxa" w:w="85"/>
             </w:tcMar>
             <w:vAlign w:val="center"/>
           </w:tcPr>
           <w:p>
             <w:pPr>
-              <w:spacing w:after="60"/>
               <w:jc w:val="center"/>
             </w:pPr>
             <w:r>
               <w:drawing>
                 <wp:inline distT="0" distB="0" distL="0" distR="0">
-                  <wp:extent cx="2981325" cy="2238375"/>
+                  <wp:extent cx="2952750" cy="2209800"/>
                   <wp:effectExtent t="0" r="0" b="0" l="0"/>
                   <wp:docPr id="1" name="" descr="" title=""/>
                   <wp:cNvGraphicFramePr>
@@ -2957,7 +2724,7 @@
                         <pic:spPr bwMode="auto">
                           <a:xfrm>
                             <a:off x="0" y="0"/>
-                            <a:ext cx="2981325" cy="2238375"/>
+                            <a:ext cx="2952750" cy="2209800"/>
                           </a:xfrm>
                           <a:prstGeom prst="rect">
                             <a:avLst/>
@@ -2970,21 +2737,12 @@
               </w:drawing>
             </w:r>
           </w:p>
-          <w:p>
-            <w:pPr>
-              <w:jc w:val="center"/>
-            </w:pPr>
-            <w:r>
-              <w:rPr>
-                <w:rFonts w:ascii="Arial" w:cs="Arial" w:eastAsia="Arial" w:hAnsi="Arial"/>
-                <w:color w:val="595959"/>
-                <w:sz w:val="16"/>
-                <w:szCs w:val="16"/>
-              </w:rPr>
-              <w:t xml:space="preserve">Фото 17</w:t>
-            </w:r>
-          </w:p>
-        </w:tc>
+        </w:tc>
+      </w:tr>
+      <w:tr>
+        <w:trPr>
+          <w:trHeight w:val="4650" w:hRule="exact"/>
+        </w:trPr>
         <w:tc>
           <w:tcPr>
             <w:tcW w:type="dxa" w:w="4819"/>
@@ -2995,22 +2753,21 @@
               <w:right w:val="none" w:color="FFFFFF" w:sz="0"/>
             </w:tcBorders>
             <w:tcMar>
-              <w:top w:type="dxa" w:w="120"/>
-              <w:left w:type="dxa" w:w="80"/>
-              <w:bottom w:type="dxa" w:w="120"/>
-              <w:right w:type="dxa" w:w="80"/>
+              <w:top w:type="dxa" w:w="100"/>
+              <w:left w:type="dxa" w:w="85"/>
+              <w:bottom w:type="dxa" w:w="100"/>
+              <w:right w:type="dxa" w:w="85"/>
             </w:tcMar>
             <w:vAlign w:val="center"/>
           </w:tcPr>
           <w:p>
             <w:pPr>
-              <w:spacing w:after="60"/>
               <w:jc w:val="center"/>
             </w:pPr>
             <w:r>
               <w:drawing>
                 <wp:inline distT="0" distB="0" distL="0" distR="0">
-                  <wp:extent cx="2981325" cy="2238375"/>
+                  <wp:extent cx="2952750" cy="2209800"/>
                   <wp:effectExtent t="0" r="0" b="0" l="0"/>
                   <wp:docPr id="1" name="" descr="" title=""/>
                   <wp:cNvGraphicFramePr>
@@ -3035,7 +2792,7 @@
                         <pic:spPr bwMode="auto">
                           <a:xfrm>
                             <a:off x="0" y="0"/>
-                            <a:ext cx="2981325" cy="2238375"/>
+                            <a:ext cx="2952750" cy="2209800"/>
                           </a:xfrm>
                           <a:prstGeom prst="rect">
                             <a:avLst/>
@@ -3048,6 +2805,24 @@
               </w:drawing>
             </w:r>
           </w:p>
+        </w:tc>
+        <w:tc>
+          <w:tcPr>
+            <w:tcW w:type="dxa" w:w="4819"/>
+            <w:tcBorders>
+              <w:top w:val="none" w:color="FFFFFF" w:sz="0"/>
+              <w:left w:val="none" w:color="FFFFFF" w:sz="0"/>
+              <w:bottom w:val="none" w:color="FFFFFF" w:sz="0"/>
+              <w:right w:val="none" w:color="FFFFFF" w:sz="0"/>
+            </w:tcBorders>
+            <w:tcMar>
+              <w:top w:type="dxa" w:w="100"/>
+              <w:left w:type="dxa" w:w="85"/>
+              <w:bottom w:type="dxa" w:w="100"/>
+              <w:right w:type="dxa" w:w="85"/>
+            </w:tcMar>
+            <w:vAlign w:val="center"/>
+          </w:tcPr>
           <w:p>
             <w:pPr>
               <w:jc w:val="center"/>
@@ -3055,11 +2830,8 @@
             <w:r>
               <w:rPr>
                 <w:rFonts w:ascii="Arial" w:cs="Arial" w:eastAsia="Arial" w:hAnsi="Arial"/>
-                <w:color w:val="595959"/>
-                <w:sz w:val="16"/>
-                <w:szCs w:val="16"/>
-              </w:rPr>
-              <w:t xml:space="preserve">Фото 18</w:t>
+              </w:rPr>
+              <w:t xml:space="preserve"/>
             </w:r>
           </w:p>
         </w:tc>
@@ -3254,8 +3026,9 @@
     <w:rPrDefault>
       <w:rPr>
         <w:rFonts w:ascii="Arial" w:cs="Arial" w:eastAsia="Arial" w:hAnsi="Arial"/>
-        <w:sz w:val="21"/>
-        <w:szCs w:val="21"/>
+        <w:color w:val="1A1A1A"/>
+        <w:sz w:val="19"/>
+        <w:szCs w:val="19"/>
       </w:rPr>
     </w:rPrDefault>
     <w:pPrDefault/>

</xml_diff>

<commit_message>
auctions: stop photo rows spilling onto the next page in Word
The sheets were sized against LibreOffice's layout and overflowed in Word,
dropping the third row of every sheet onto a page of its own. The break
paragraph before each sheet was eating a line at the top of the page and
the label height was a guess. Page breaks now ride on the label paragraph,
that label has an exact line height, and each sheet keeps ~1.7 cm of slack
so the two renderers can disagree without costing a row.
</commit_message>
<xml_diff>
--- a/auctions/out/Торги_Москва_и_Подмосковье.docx
+++ b/auctions/out/Торги_Москва_и_Подмосковье.docx
@@ -85,7 +85,7 @@
     </w:p>
     <w:tbl>
       <w:tblPr>
-        <w:tblW w:type="dxa" w:w="9638"/>
+        <w:tblW w:type="dxa" w:w="9864"/>
         <w:tblBorders>
           <w:top w:val="single" w:color="auto" w:sz="4"/>
           <w:left w:val="single" w:color="auto" w:sz="4"/>
@@ -97,7 +97,7 @@
       </w:tblPr>
       <w:tblGrid>
         <w:gridCol w:w="3100"/>
-        <w:gridCol w:w="6538"/>
+        <w:gridCol w:w="6764"/>
       </w:tblGrid>
       <w:tr>
         <w:tc>
@@ -134,7 +134,7 @@
         </w:tc>
         <w:tc>
           <w:tcPr>
-            <w:tcW w:type="dxa" w:w="6538"/>
+            <w:tcW w:type="dxa" w:w="6764"/>
             <w:tcBorders>
               <w:top w:val="single" w:color="D0D7E5" w:sz="4"/>
               <w:left w:val="single" w:color="D0D7E5" w:sz="4"/>
@@ -199,7 +199,7 @@
         </w:tc>
         <w:tc>
           <w:tcPr>
-            <w:tcW w:type="dxa" w:w="6538"/>
+            <w:tcW w:type="dxa" w:w="6764"/>
             <w:tcBorders>
               <w:top w:val="single" w:color="D0D7E5" w:sz="4"/>
               <w:left w:val="single" w:color="D0D7E5" w:sz="4"/>
@@ -264,7 +264,7 @@
         </w:tc>
         <w:tc>
           <w:tcPr>
-            <w:tcW w:type="dxa" w:w="6538"/>
+            <w:tcW w:type="dxa" w:w="6764"/>
             <w:tcBorders>
               <w:top w:val="single" w:color="D0D7E5" w:sz="4"/>
               <w:left w:val="single" w:color="D0D7E5" w:sz="4"/>
@@ -329,7 +329,7 @@
         </w:tc>
         <w:tc>
           <w:tcPr>
-            <w:tcW w:type="dxa" w:w="6538"/>
+            <w:tcW w:type="dxa" w:w="6764"/>
             <w:tcBorders>
               <w:top w:val="single" w:color="D0D7E5" w:sz="4"/>
               <w:left w:val="single" w:color="D0D7E5" w:sz="4"/>
@@ -394,7 +394,7 @@
         </w:tc>
         <w:tc>
           <w:tcPr>
-            <w:tcW w:type="dxa" w:w="6538"/>
+            <w:tcW w:type="dxa" w:w="6764"/>
             <w:tcBorders>
               <w:top w:val="single" w:color="D0D7E5" w:sz="4"/>
               <w:left w:val="single" w:color="D0D7E5" w:sz="4"/>
@@ -459,7 +459,7 @@
         </w:tc>
         <w:tc>
           <w:tcPr>
-            <w:tcW w:type="dxa" w:w="6538"/>
+            <w:tcW w:type="dxa" w:w="6764"/>
             <w:tcBorders>
               <w:top w:val="single" w:color="D0D7E5" w:sz="4"/>
               <w:left w:val="single" w:color="D0D7E5" w:sz="4"/>
@@ -524,7 +524,7 @@
         </w:tc>
         <w:tc>
           <w:tcPr>
-            <w:tcW w:type="dxa" w:w="6538"/>
+            <w:tcW w:type="dxa" w:w="6764"/>
             <w:tcBorders>
               <w:top w:val="single" w:color="D0D7E5" w:sz="4"/>
               <w:left w:val="single" w:color="D0D7E5" w:sz="4"/>
@@ -577,7 +577,7 @@
     </w:p>
     <w:tbl>
       <w:tblPr>
-        <w:tblW w:type="dxa" w:w="9638"/>
+        <w:tblW w:type="dxa" w:w="9864"/>
         <w:tblBorders>
           <w:top w:val="single" w:color="auto" w:sz="4"/>
           <w:left w:val="single" w:color="auto" w:sz="4"/>
@@ -589,7 +589,7 @@
       </w:tblPr>
       <w:tblGrid>
         <w:gridCol w:w="3100"/>
-        <w:gridCol w:w="6538"/>
+        <w:gridCol w:w="6764"/>
       </w:tblGrid>
       <w:tr>
         <w:tc>
@@ -626,7 +626,7 @@
         </w:tc>
         <w:tc>
           <w:tcPr>
-            <w:tcW w:type="dxa" w:w="6538"/>
+            <w:tcW w:type="dxa" w:w="6764"/>
             <w:tcBorders>
               <w:top w:val="single" w:color="D0D7E5" w:sz="4"/>
               <w:left w:val="single" w:color="D0D7E5" w:sz="4"/>
@@ -691,7 +691,7 @@
         </w:tc>
         <w:tc>
           <w:tcPr>
-            <w:tcW w:type="dxa" w:w="6538"/>
+            <w:tcW w:type="dxa" w:w="6764"/>
             <w:tcBorders>
               <w:top w:val="single" w:color="D0D7E5" w:sz="4"/>
               <w:left w:val="single" w:color="D0D7E5" w:sz="4"/>
@@ -756,7 +756,7 @@
         </w:tc>
         <w:tc>
           <w:tcPr>
-            <w:tcW w:type="dxa" w:w="6538"/>
+            <w:tcW w:type="dxa" w:w="6764"/>
             <w:tcBorders>
               <w:top w:val="single" w:color="D0D7E5" w:sz="4"/>
               <w:left w:val="single" w:color="D0D7E5" w:sz="4"/>
@@ -821,7 +821,7 @@
         </w:tc>
         <w:tc>
           <w:tcPr>
-            <w:tcW w:type="dxa" w:w="6538"/>
+            <w:tcW w:type="dxa" w:w="6764"/>
             <w:tcBorders>
               <w:top w:val="single" w:color="D0D7E5" w:sz="4"/>
               <w:left w:val="single" w:color="D0D7E5" w:sz="4"/>
@@ -886,7 +886,7 @@
         </w:tc>
         <w:tc>
           <w:tcPr>
-            <w:tcW w:type="dxa" w:w="6538"/>
+            <w:tcW w:type="dxa" w:w="6764"/>
             <w:tcBorders>
               <w:top w:val="single" w:color="D0D7E5" w:sz="4"/>
               <w:left w:val="single" w:color="D0D7E5" w:sz="4"/>
@@ -951,7 +951,7 @@
         </w:tc>
         <w:tc>
           <w:tcPr>
-            <w:tcW w:type="dxa" w:w="6538"/>
+            <w:tcW w:type="dxa" w:w="6764"/>
             <w:tcBorders>
               <w:top w:val="single" w:color="D0D7E5" w:sz="4"/>
               <w:left w:val="single" w:color="D0D7E5" w:sz="4"/>
@@ -1016,7 +1016,7 @@
         </w:tc>
         <w:tc>
           <w:tcPr>
-            <w:tcW w:type="dxa" w:w="6538"/>
+            <w:tcW w:type="dxa" w:w="6764"/>
             <w:tcBorders>
               <w:top w:val="single" w:color="D0D7E5" w:sz="4"/>
               <w:left w:val="single" w:color="D0D7E5" w:sz="4"/>
@@ -1081,7 +1081,7 @@
         </w:tc>
         <w:tc>
           <w:tcPr>
-            <w:tcW w:type="dxa" w:w="6538"/>
+            <w:tcW w:type="dxa" w:w="6764"/>
             <w:tcBorders>
               <w:top w:val="single" w:color="D0D7E5" w:sz="4"/>
               <w:left w:val="single" w:color="D0D7E5" w:sz="4"/>
@@ -1146,7 +1146,7 @@
         </w:tc>
         <w:tc>
           <w:tcPr>
-            <w:tcW w:type="dxa" w:w="6538"/>
+            <w:tcW w:type="dxa" w:w="6764"/>
             <w:tcBorders>
               <w:top w:val="single" w:color="D0D7E5" w:sz="4"/>
               <w:left w:val="single" w:color="D0D7E5" w:sz="4"/>
@@ -1211,7 +1211,7 @@
         </w:tc>
         <w:tc>
           <w:tcPr>
-            <w:tcW w:type="dxa" w:w="6538"/>
+            <w:tcW w:type="dxa" w:w="6764"/>
             <w:tcBorders>
               <w:top w:val="single" w:color="D0D7E5" w:sz="4"/>
               <w:left w:val="single" w:color="D0D7E5" w:sz="4"/>
@@ -1276,7 +1276,7 @@
         </w:tc>
         <w:tc>
           <w:tcPr>
-            <w:tcW w:type="dxa" w:w="6538"/>
+            <w:tcW w:type="dxa" w:w="6764"/>
             <w:tcBorders>
               <w:top w:val="single" w:color="D0D7E5" w:sz="4"/>
               <w:left w:val="single" w:color="D0D7E5" w:sz="4"/>
@@ -1320,7 +1320,7 @@
         </w:rPr>
         <w:t xml:space="preserve">Объявление: </w:t>
       </w:r>
-      <w:hyperlink w:history="1" r:id="rIdsd7up4v8ask00w8nvwkrm">
+      <w:hyperlink w:history="1" r:id="rId5bug7ybfu9gskhyqape5o">
         <w:r>
           <w:rPr>
             <w:rFonts w:ascii="Arial" w:cs="Arial" w:eastAsia="Arial" w:hAnsi="Arial"/>
@@ -1334,16 +1334,12 @@
       </w:hyperlink>
     </w:p>
     <w:p>
-      <w:r>
-        <w:br w:type="page"/>
-      </w:r>
-    </w:p>
-    <w:p>
       <w:pPr>
+        <w:pageBreakBefore/>
         <w:pBdr>
           <w:bottom w:val="single" w:color="D0D7E5" w:sz="4"/>
         </w:pBdr>
-        <w:spacing w:after="120" w:before="240"/>
+        <w:spacing w:after="120" w:before="0" w:line="260" w:lineRule="exact"/>
       </w:pPr>
       <w:r>
         <w:rPr>
@@ -1360,7 +1356,7 @@
     </w:p>
     <w:p>
       <w:pPr>
-        <w:spacing w:after="120" w:before="0"/>
+        <w:spacing w:after="120" w:before="0" w:line="240" w:lineRule="exact"/>
       </w:pPr>
       <w:r>
         <w:rPr>
@@ -1374,12 +1370,13 @@
     </w:p>
     <w:p>
       <w:pPr>
+        <w:spacing w:after="0" w:before="0"/>
         <w:jc w:val="center"/>
       </w:pPr>
       <w:r>
         <w:drawing>
           <wp:inline distT="0" distB="0" distL="0" distR="0">
-            <wp:extent cx="6115050" cy="5010150"/>
+            <wp:extent cx="6257925" cy="5124450"/>
             <wp:effectExtent t="0" r="0" b="0" l="0"/>
             <wp:docPr id="1" name="" descr="" title=""/>
             <wp:cNvGraphicFramePr>
@@ -1404,7 +1401,7 @@
                   <pic:spPr bwMode="auto">
                     <a:xfrm>
                       <a:off x="0" y="0"/>
-                      <a:ext cx="6115050" cy="5010150"/>
+                      <a:ext cx="6257925" cy="5124450"/>
                     </a:xfrm>
                     <a:prstGeom prst="rect">
                       <a:avLst/>
@@ -1419,7 +1416,7 @@
     </w:p>
     <w:p>
       <w:pPr>
-        <w:spacing w:after="0" w:before="120"/>
+        <w:spacing w:after="0" w:before="120" w:line="240" w:lineRule="exact"/>
         <w:jc w:val="center"/>
       </w:pPr>
       <w:r>
@@ -1437,7 +1434,7 @@
         <w:pBdr>
           <w:bottom w:val="single" w:color="D0D7E5" w:sz="4"/>
         </w:pBdr>
-        <w:spacing w:after="120" w:before="240"/>
+        <w:spacing w:after="120" w:before="240" w:line="260" w:lineRule="exact"/>
       </w:pPr>
       <w:r>
         <w:rPr>
@@ -1454,7 +1451,7 @@
     </w:p>
     <w:tbl>
       <w:tblPr>
-        <w:tblW w:type="dxa" w:w="9638"/>
+        <w:tblW w:type="dxa" w:w="9864"/>
         <w:tblBorders>
           <w:top w:val="none" w:color="FFFFFF" w:sz="0"/>
           <w:left w:val="none" w:color="FFFFFF" w:sz="0"/>
@@ -1465,16 +1462,17 @@
         </w:tblBorders>
       </w:tblPr>
       <w:tblGrid>
-        <w:gridCol w:w="4819"/>
-        <w:gridCol w:w="4819"/>
+        <w:gridCol w:w="4932"/>
+        <w:gridCol w:w="4932"/>
       </w:tblGrid>
       <w:tr>
         <w:trPr>
-          <w:trHeight w:val="4560" w:hRule="exact"/>
+          <w:cantSplit/>
+          <w:trHeight w:val="4046" w:hRule="exact"/>
         </w:trPr>
         <w:tc>
           <w:tcPr>
-            <w:tcW w:type="dxa" w:w="4819"/>
+            <w:tcW w:type="dxa" w:w="4932"/>
             <w:tcBorders>
               <w:top w:val="none" w:color="FFFFFF" w:sz="0"/>
               <w:left w:val="none" w:color="FFFFFF" w:sz="0"/>
@@ -1496,7 +1494,7 @@
             <w:r>
               <w:drawing>
                 <wp:inline distT="0" distB="0" distL="0" distR="0">
-                  <wp:extent cx="2952750" cy="2209800"/>
+                  <wp:extent cx="3019425" cy="2266950"/>
                   <wp:effectExtent t="0" r="0" b="0" l="0"/>
                   <wp:docPr id="1" name="" descr="" title=""/>
                   <wp:cNvGraphicFramePr>
@@ -1521,7 +1519,7 @@
                         <pic:spPr bwMode="auto">
                           <a:xfrm>
                             <a:off x="0" y="0"/>
-                            <a:ext cx="2952750" cy="2209800"/>
+                            <a:ext cx="3019425" cy="2266950"/>
                           </a:xfrm>
                           <a:prstGeom prst="rect">
                             <a:avLst/>
@@ -1537,7 +1535,7 @@
         </w:tc>
         <w:tc>
           <w:tcPr>
-            <w:tcW w:type="dxa" w:w="4819"/>
+            <w:tcW w:type="dxa" w:w="4932"/>
             <w:tcBorders>
               <w:top w:val="none" w:color="FFFFFF" w:sz="0"/>
               <w:left w:val="none" w:color="FFFFFF" w:sz="0"/>
@@ -1559,7 +1557,7 @@
             <w:r>
               <w:drawing>
                 <wp:inline distT="0" distB="0" distL="0" distR="0">
-                  <wp:extent cx="2952750" cy="2209800"/>
+                  <wp:extent cx="3019425" cy="2266950"/>
                   <wp:effectExtent t="0" r="0" b="0" l="0"/>
                   <wp:docPr id="1" name="" descr="" title=""/>
                   <wp:cNvGraphicFramePr>
@@ -1584,7 +1582,7 @@
                         <pic:spPr bwMode="auto">
                           <a:xfrm>
                             <a:off x="0" y="0"/>
-                            <a:ext cx="2952750" cy="2209800"/>
+                            <a:ext cx="3019425" cy="2266950"/>
                           </a:xfrm>
                           <a:prstGeom prst="rect">
                             <a:avLst/>
@@ -1601,16 +1599,12 @@
       </w:tr>
     </w:tbl>
     <w:p>
-      <w:r>
-        <w:br w:type="page"/>
-      </w:r>
-    </w:p>
-    <w:p>
       <w:pPr>
+        <w:pageBreakBefore/>
         <w:pBdr>
           <w:bottom w:val="single" w:color="D0D7E5" w:sz="4"/>
         </w:pBdr>
-        <w:spacing w:after="120" w:before="240"/>
+        <w:spacing w:after="120" w:before="0" w:line="260" w:lineRule="exact"/>
       </w:pPr>
       <w:r>
         <w:rPr>
@@ -1627,7 +1621,7 @@
     </w:p>
     <w:tbl>
       <w:tblPr>
-        <w:tblW w:type="dxa" w:w="9638"/>
+        <w:tblW w:type="dxa" w:w="9864"/>
         <w:tblBorders>
           <w:top w:val="none" w:color="FFFFFF" w:sz="0"/>
           <w:left w:val="none" w:color="FFFFFF" w:sz="0"/>
@@ -1638,16 +1632,17 @@
         </w:tblBorders>
       </w:tblPr>
       <w:tblGrid>
-        <w:gridCol w:w="4819"/>
-        <w:gridCol w:w="4819"/>
+        <w:gridCol w:w="4932"/>
+        <w:gridCol w:w="4932"/>
       </w:tblGrid>
       <w:tr>
         <w:trPr>
-          <w:trHeight w:val="4650" w:hRule="exact"/>
+          <w:cantSplit/>
+          <w:trHeight w:val="4465" w:hRule="exact"/>
         </w:trPr>
         <w:tc>
           <w:tcPr>
-            <w:tcW w:type="dxa" w:w="4819"/>
+            <w:tcW w:type="dxa" w:w="4932"/>
             <w:tcBorders>
               <w:top w:val="none" w:color="FFFFFF" w:sz="0"/>
               <w:left w:val="none" w:color="FFFFFF" w:sz="0"/>
@@ -1669,7 +1664,7 @@
             <w:r>
               <w:drawing>
                 <wp:inline distT="0" distB="0" distL="0" distR="0">
-                  <wp:extent cx="2952750" cy="2209800"/>
+                  <wp:extent cx="3019425" cy="2266950"/>
                   <wp:effectExtent t="0" r="0" b="0" l="0"/>
                   <wp:docPr id="1" name="" descr="" title=""/>
                   <wp:cNvGraphicFramePr>
@@ -1694,7 +1689,7 @@
                         <pic:spPr bwMode="auto">
                           <a:xfrm>
                             <a:off x="0" y="0"/>
-                            <a:ext cx="2952750" cy="2209800"/>
+                            <a:ext cx="3019425" cy="2266950"/>
                           </a:xfrm>
                           <a:prstGeom prst="rect">
                             <a:avLst/>
@@ -1710,7 +1705,7 @@
         </w:tc>
         <w:tc>
           <w:tcPr>
-            <w:tcW w:type="dxa" w:w="4819"/>
+            <w:tcW w:type="dxa" w:w="4932"/>
             <w:tcBorders>
               <w:top w:val="none" w:color="FFFFFF" w:sz="0"/>
               <w:left w:val="none" w:color="FFFFFF" w:sz="0"/>
@@ -1732,7 +1727,7 @@
             <w:r>
               <w:drawing>
                 <wp:inline distT="0" distB="0" distL="0" distR="0">
-                  <wp:extent cx="2952750" cy="1914525"/>
+                  <wp:extent cx="3019425" cy="1952625"/>
                   <wp:effectExtent t="0" r="0" b="0" l="0"/>
                   <wp:docPr id="1" name="" descr="" title=""/>
                   <wp:cNvGraphicFramePr>
@@ -1757,7 +1752,7 @@
                         <pic:spPr bwMode="auto">
                           <a:xfrm>
                             <a:off x="0" y="0"/>
-                            <a:ext cx="2952750" cy="1914525"/>
+                            <a:ext cx="3019425" cy="1952625"/>
                           </a:xfrm>
                           <a:prstGeom prst="rect">
                             <a:avLst/>
@@ -1774,11 +1769,12 @@
       </w:tr>
       <w:tr>
         <w:trPr>
-          <w:trHeight w:val="4650" w:hRule="exact"/>
+          <w:cantSplit/>
+          <w:trHeight w:val="4465" w:hRule="exact"/>
         </w:trPr>
         <w:tc>
           <w:tcPr>
-            <w:tcW w:type="dxa" w:w="4819"/>
+            <w:tcW w:type="dxa" w:w="4932"/>
             <w:tcBorders>
               <w:top w:val="none" w:color="FFFFFF" w:sz="0"/>
               <w:left w:val="none" w:color="FFFFFF" w:sz="0"/>
@@ -1800,7 +1796,7 @@
             <w:r>
               <w:drawing>
                 <wp:inline distT="0" distB="0" distL="0" distR="0">
-                  <wp:extent cx="2952750" cy="2209800"/>
+                  <wp:extent cx="3019425" cy="2266950"/>
                   <wp:effectExtent t="0" r="0" b="0" l="0"/>
                   <wp:docPr id="1" name="" descr="" title=""/>
                   <wp:cNvGraphicFramePr>
@@ -1825,7 +1821,7 @@
                         <pic:spPr bwMode="auto">
                           <a:xfrm>
                             <a:off x="0" y="0"/>
-                            <a:ext cx="2952750" cy="2209800"/>
+                            <a:ext cx="3019425" cy="2266950"/>
                           </a:xfrm>
                           <a:prstGeom prst="rect">
                             <a:avLst/>
@@ -1841,7 +1837,7 @@
         </w:tc>
         <w:tc>
           <w:tcPr>
-            <w:tcW w:type="dxa" w:w="4819"/>
+            <w:tcW w:type="dxa" w:w="4932"/>
             <w:tcBorders>
               <w:top w:val="none" w:color="FFFFFF" w:sz="0"/>
               <w:left w:val="none" w:color="FFFFFF" w:sz="0"/>
@@ -1863,7 +1859,7 @@
             <w:r>
               <w:drawing>
                 <wp:inline distT="0" distB="0" distL="0" distR="0">
-                  <wp:extent cx="2952750" cy="2209800"/>
+                  <wp:extent cx="3019425" cy="2266950"/>
                   <wp:effectExtent t="0" r="0" b="0" l="0"/>
                   <wp:docPr id="1" name="" descr="" title=""/>
                   <wp:cNvGraphicFramePr>
@@ -1888,7 +1884,7 @@
                         <pic:spPr bwMode="auto">
                           <a:xfrm>
                             <a:off x="0" y="0"/>
-                            <a:ext cx="2952750" cy="2209800"/>
+                            <a:ext cx="3019425" cy="2266950"/>
                           </a:xfrm>
                           <a:prstGeom prst="rect">
                             <a:avLst/>
@@ -1905,11 +1901,12 @@
       </w:tr>
       <w:tr>
         <w:trPr>
-          <w:trHeight w:val="4650" w:hRule="exact"/>
+          <w:cantSplit/>
+          <w:trHeight w:val="4465" w:hRule="exact"/>
         </w:trPr>
         <w:tc>
           <w:tcPr>
-            <w:tcW w:type="dxa" w:w="4819"/>
+            <w:tcW w:type="dxa" w:w="4932"/>
             <w:tcBorders>
               <w:top w:val="none" w:color="FFFFFF" w:sz="0"/>
               <w:left w:val="none" w:color="FFFFFF" w:sz="0"/>
@@ -1931,7 +1928,7 @@
             <w:r>
               <w:drawing>
                 <wp:inline distT="0" distB="0" distL="0" distR="0">
-                  <wp:extent cx="2952750" cy="2209800"/>
+                  <wp:extent cx="3019425" cy="2266950"/>
                   <wp:effectExtent t="0" r="0" b="0" l="0"/>
                   <wp:docPr id="1" name="" descr="" title=""/>
                   <wp:cNvGraphicFramePr>
@@ -1956,7 +1953,7 @@
                         <pic:spPr bwMode="auto">
                           <a:xfrm>
                             <a:off x="0" y="0"/>
-                            <a:ext cx="2952750" cy="2209800"/>
+                            <a:ext cx="3019425" cy="2266950"/>
                           </a:xfrm>
                           <a:prstGeom prst="rect">
                             <a:avLst/>
@@ -1972,7 +1969,7 @@
         </w:tc>
         <w:tc>
           <w:tcPr>
-            <w:tcW w:type="dxa" w:w="4819"/>
+            <w:tcW w:type="dxa" w:w="4932"/>
             <w:tcBorders>
               <w:top w:val="none" w:color="FFFFFF" w:sz="0"/>
               <w:left w:val="none" w:color="FFFFFF" w:sz="0"/>
@@ -1994,7 +1991,7 @@
             <w:r>
               <w:drawing>
                 <wp:inline distT="0" distB="0" distL="0" distR="0">
-                  <wp:extent cx="2952750" cy="2209800"/>
+                  <wp:extent cx="3019425" cy="2266950"/>
                   <wp:effectExtent t="0" r="0" b="0" l="0"/>
                   <wp:docPr id="1" name="" descr="" title=""/>
                   <wp:cNvGraphicFramePr>
@@ -2019,7 +2016,7 @@
                         <pic:spPr bwMode="auto">
                           <a:xfrm>
                             <a:off x="0" y="0"/>
-                            <a:ext cx="2952750" cy="2209800"/>
+                            <a:ext cx="3019425" cy="2266950"/>
                           </a:xfrm>
                           <a:prstGeom prst="rect">
                             <a:avLst/>
@@ -2036,16 +2033,12 @@
       </w:tr>
     </w:tbl>
     <w:p>
-      <w:r>
-        <w:br w:type="page"/>
-      </w:r>
-    </w:p>
-    <w:p>
       <w:pPr>
+        <w:pageBreakBefore/>
         <w:pBdr>
           <w:bottom w:val="single" w:color="D0D7E5" w:sz="4"/>
         </w:pBdr>
-        <w:spacing w:after="120" w:before="240"/>
+        <w:spacing w:after="120" w:before="0" w:line="260" w:lineRule="exact"/>
       </w:pPr>
       <w:r>
         <w:rPr>
@@ -2062,7 +2055,7 @@
     </w:p>
     <w:tbl>
       <w:tblPr>
-        <w:tblW w:type="dxa" w:w="9638"/>
+        <w:tblW w:type="dxa" w:w="9864"/>
         <w:tblBorders>
           <w:top w:val="none" w:color="FFFFFF" w:sz="0"/>
           <w:left w:val="none" w:color="FFFFFF" w:sz="0"/>
@@ -2073,16 +2066,17 @@
         </w:tblBorders>
       </w:tblPr>
       <w:tblGrid>
-        <w:gridCol w:w="4819"/>
-        <w:gridCol w:w="4819"/>
+        <w:gridCol w:w="4932"/>
+        <w:gridCol w:w="4932"/>
       </w:tblGrid>
       <w:tr>
         <w:trPr>
-          <w:trHeight w:val="4650" w:hRule="exact"/>
+          <w:cantSplit/>
+          <w:trHeight w:val="4465" w:hRule="exact"/>
         </w:trPr>
         <w:tc>
           <w:tcPr>
-            <w:tcW w:type="dxa" w:w="4819"/>
+            <w:tcW w:type="dxa" w:w="4932"/>
             <w:tcBorders>
               <w:top w:val="none" w:color="FFFFFF" w:sz="0"/>
               <w:left w:val="none" w:color="FFFFFF" w:sz="0"/>
@@ -2104,7 +2098,7 @@
             <w:r>
               <w:drawing>
                 <wp:inline distT="0" distB="0" distL="0" distR="0">
-                  <wp:extent cx="2952750" cy="2209800"/>
+                  <wp:extent cx="3019425" cy="2266950"/>
                   <wp:effectExtent t="0" r="0" b="0" l="0"/>
                   <wp:docPr id="1" name="" descr="" title=""/>
                   <wp:cNvGraphicFramePr>
@@ -2129,7 +2123,7 @@
                         <pic:spPr bwMode="auto">
                           <a:xfrm>
                             <a:off x="0" y="0"/>
-                            <a:ext cx="2952750" cy="2209800"/>
+                            <a:ext cx="3019425" cy="2266950"/>
                           </a:xfrm>
                           <a:prstGeom prst="rect">
                             <a:avLst/>
@@ -2145,7 +2139,7 @@
         </w:tc>
         <w:tc>
           <w:tcPr>
-            <w:tcW w:type="dxa" w:w="4819"/>
+            <w:tcW w:type="dxa" w:w="4932"/>
             <w:tcBorders>
               <w:top w:val="none" w:color="FFFFFF" w:sz="0"/>
               <w:left w:val="none" w:color="FFFFFF" w:sz="0"/>
@@ -2167,7 +2161,7 @@
             <w:r>
               <w:drawing>
                 <wp:inline distT="0" distB="0" distL="0" distR="0">
-                  <wp:extent cx="2952750" cy="2209800"/>
+                  <wp:extent cx="3019425" cy="2266950"/>
                   <wp:effectExtent t="0" r="0" b="0" l="0"/>
                   <wp:docPr id="1" name="" descr="" title=""/>
                   <wp:cNvGraphicFramePr>
@@ -2192,7 +2186,7 @@
                         <pic:spPr bwMode="auto">
                           <a:xfrm>
                             <a:off x="0" y="0"/>
-                            <a:ext cx="2952750" cy="2209800"/>
+                            <a:ext cx="3019425" cy="2266950"/>
                           </a:xfrm>
                           <a:prstGeom prst="rect">
                             <a:avLst/>
@@ -2209,11 +2203,12 @@
       </w:tr>
       <w:tr>
         <w:trPr>
-          <w:trHeight w:val="4650" w:hRule="exact"/>
+          <w:cantSplit/>
+          <w:trHeight w:val="4465" w:hRule="exact"/>
         </w:trPr>
         <w:tc>
           <w:tcPr>
-            <w:tcW w:type="dxa" w:w="4819"/>
+            <w:tcW w:type="dxa" w:w="4932"/>
             <w:tcBorders>
               <w:top w:val="none" w:color="FFFFFF" w:sz="0"/>
               <w:left w:val="none" w:color="FFFFFF" w:sz="0"/>
@@ -2235,7 +2230,7 @@
             <w:r>
               <w:drawing>
                 <wp:inline distT="0" distB="0" distL="0" distR="0">
-                  <wp:extent cx="2952750" cy="2209800"/>
+                  <wp:extent cx="3019425" cy="2266950"/>
                   <wp:effectExtent t="0" r="0" b="0" l="0"/>
                   <wp:docPr id="1" name="" descr="" title=""/>
                   <wp:cNvGraphicFramePr>
@@ -2260,7 +2255,7 @@
                         <pic:spPr bwMode="auto">
                           <a:xfrm>
                             <a:off x="0" y="0"/>
-                            <a:ext cx="2952750" cy="2209800"/>
+                            <a:ext cx="3019425" cy="2266950"/>
                           </a:xfrm>
                           <a:prstGeom prst="rect">
                             <a:avLst/>
@@ -2276,7 +2271,7 @@
         </w:tc>
         <w:tc>
           <w:tcPr>
-            <w:tcW w:type="dxa" w:w="4819"/>
+            <w:tcW w:type="dxa" w:w="4932"/>
             <w:tcBorders>
               <w:top w:val="none" w:color="FFFFFF" w:sz="0"/>
               <w:left w:val="none" w:color="FFFFFF" w:sz="0"/>
@@ -2298,7 +2293,7 @@
             <w:r>
               <w:drawing>
                 <wp:inline distT="0" distB="0" distL="0" distR="0">
-                  <wp:extent cx="2952750" cy="2209800"/>
+                  <wp:extent cx="3019425" cy="2266950"/>
                   <wp:effectExtent t="0" r="0" b="0" l="0"/>
                   <wp:docPr id="1" name="" descr="" title=""/>
                   <wp:cNvGraphicFramePr>
@@ -2323,7 +2318,7 @@
                         <pic:spPr bwMode="auto">
                           <a:xfrm>
                             <a:off x="0" y="0"/>
-                            <a:ext cx="2952750" cy="2209800"/>
+                            <a:ext cx="3019425" cy="2266950"/>
                           </a:xfrm>
                           <a:prstGeom prst="rect">
                             <a:avLst/>
@@ -2340,11 +2335,12 @@
       </w:tr>
       <w:tr>
         <w:trPr>
-          <w:trHeight w:val="4650" w:hRule="exact"/>
+          <w:cantSplit/>
+          <w:trHeight w:val="4465" w:hRule="exact"/>
         </w:trPr>
         <w:tc>
           <w:tcPr>
-            <w:tcW w:type="dxa" w:w="4819"/>
+            <w:tcW w:type="dxa" w:w="4932"/>
             <w:tcBorders>
               <w:top w:val="none" w:color="FFFFFF" w:sz="0"/>
               <w:left w:val="none" w:color="FFFFFF" w:sz="0"/>
@@ -2366,7 +2362,7 @@
             <w:r>
               <w:drawing>
                 <wp:inline distT="0" distB="0" distL="0" distR="0">
-                  <wp:extent cx="2952750" cy="2209800"/>
+                  <wp:extent cx="3019425" cy="2266950"/>
                   <wp:effectExtent t="0" r="0" b="0" l="0"/>
                   <wp:docPr id="1" name="" descr="" title=""/>
                   <wp:cNvGraphicFramePr>
@@ -2391,7 +2387,7 @@
                         <pic:spPr bwMode="auto">
                           <a:xfrm>
                             <a:off x="0" y="0"/>
-                            <a:ext cx="2952750" cy="2209800"/>
+                            <a:ext cx="3019425" cy="2266950"/>
                           </a:xfrm>
                           <a:prstGeom prst="rect">
                             <a:avLst/>
@@ -2407,7 +2403,7 @@
         </w:tc>
         <w:tc>
           <w:tcPr>
-            <w:tcW w:type="dxa" w:w="4819"/>
+            <w:tcW w:type="dxa" w:w="4932"/>
             <w:tcBorders>
               <w:top w:val="none" w:color="FFFFFF" w:sz="0"/>
               <w:left w:val="none" w:color="FFFFFF" w:sz="0"/>
@@ -2437,16 +2433,12 @@
       </w:tr>
     </w:tbl>
     <w:p>
-      <w:r>
-        <w:br w:type="page"/>
-      </w:r>
-    </w:p>
-    <w:p>
       <w:pPr>
+        <w:pageBreakBefore/>
         <w:pBdr>
           <w:bottom w:val="single" w:color="D0D7E5" w:sz="4"/>
         </w:pBdr>
-        <w:spacing w:after="120" w:before="240"/>
+        <w:spacing w:after="120" w:before="0" w:line="260" w:lineRule="exact"/>
       </w:pPr>
       <w:r>
         <w:rPr>
@@ -2463,7 +2455,7 @@
     </w:p>
     <w:tbl>
       <w:tblPr>
-        <w:tblW w:type="dxa" w:w="9638"/>
+        <w:tblW w:type="dxa" w:w="9864"/>
         <w:tblBorders>
           <w:top w:val="none" w:color="FFFFFF" w:sz="0"/>
           <w:left w:val="none" w:color="FFFFFF" w:sz="0"/>
@@ -2474,16 +2466,17 @@
         </w:tblBorders>
       </w:tblPr>
       <w:tblGrid>
-        <w:gridCol w:w="4819"/>
-        <w:gridCol w:w="4819"/>
+        <w:gridCol w:w="4932"/>
+        <w:gridCol w:w="4932"/>
       </w:tblGrid>
       <w:tr>
         <w:trPr>
-          <w:trHeight w:val="4650" w:hRule="exact"/>
+          <w:cantSplit/>
+          <w:trHeight w:val="4465" w:hRule="exact"/>
         </w:trPr>
         <w:tc>
           <w:tcPr>
-            <w:tcW w:type="dxa" w:w="4819"/>
+            <w:tcW w:type="dxa" w:w="4932"/>
             <w:tcBorders>
               <w:top w:val="none" w:color="FFFFFF" w:sz="0"/>
               <w:left w:val="none" w:color="FFFFFF" w:sz="0"/>
@@ -2505,7 +2498,7 @@
             <w:r>
               <w:drawing>
                 <wp:inline distT="0" distB="0" distL="0" distR="0">
-                  <wp:extent cx="2952750" cy="2209800"/>
+                  <wp:extent cx="3019425" cy="2266950"/>
                   <wp:effectExtent t="0" r="0" b="0" l="0"/>
                   <wp:docPr id="1" name="" descr="" title=""/>
                   <wp:cNvGraphicFramePr>
@@ -2530,7 +2523,7 @@
                         <pic:spPr bwMode="auto">
                           <a:xfrm>
                             <a:off x="0" y="0"/>
-                            <a:ext cx="2952750" cy="2209800"/>
+                            <a:ext cx="3019425" cy="2266950"/>
                           </a:xfrm>
                           <a:prstGeom prst="rect">
                             <a:avLst/>
@@ -2546,7 +2539,7 @@
         </w:tc>
         <w:tc>
           <w:tcPr>
-            <w:tcW w:type="dxa" w:w="4819"/>
+            <w:tcW w:type="dxa" w:w="4932"/>
             <w:tcBorders>
               <w:top w:val="none" w:color="FFFFFF" w:sz="0"/>
               <w:left w:val="none" w:color="FFFFFF" w:sz="0"/>
@@ -2568,7 +2561,7 @@
             <w:r>
               <w:drawing>
                 <wp:inline distT="0" distB="0" distL="0" distR="0">
-                  <wp:extent cx="2952750" cy="2209800"/>
+                  <wp:extent cx="3019425" cy="2266950"/>
                   <wp:effectExtent t="0" r="0" b="0" l="0"/>
                   <wp:docPr id="1" name="" descr="" title=""/>
                   <wp:cNvGraphicFramePr>
@@ -2593,7 +2586,7 @@
                         <pic:spPr bwMode="auto">
                           <a:xfrm>
                             <a:off x="0" y="0"/>
-                            <a:ext cx="2952750" cy="2209800"/>
+                            <a:ext cx="3019425" cy="2266950"/>
                           </a:xfrm>
                           <a:prstGeom prst="rect">
                             <a:avLst/>
@@ -2610,11 +2603,12 @@
       </w:tr>
       <w:tr>
         <w:trPr>
-          <w:trHeight w:val="4650" w:hRule="exact"/>
+          <w:cantSplit/>
+          <w:trHeight w:val="4465" w:hRule="exact"/>
         </w:trPr>
         <w:tc>
           <w:tcPr>
-            <w:tcW w:type="dxa" w:w="4819"/>
+            <w:tcW w:type="dxa" w:w="4932"/>
             <w:tcBorders>
               <w:top w:val="none" w:color="FFFFFF" w:sz="0"/>
               <w:left w:val="none" w:color="FFFFFF" w:sz="0"/>
@@ -2636,7 +2630,7 @@
             <w:r>
               <w:drawing>
                 <wp:inline distT="0" distB="0" distL="0" distR="0">
-                  <wp:extent cx="2952750" cy="2209800"/>
+                  <wp:extent cx="3019425" cy="2266950"/>
                   <wp:effectExtent t="0" r="0" b="0" l="0"/>
                   <wp:docPr id="1" name="" descr="" title=""/>
                   <wp:cNvGraphicFramePr>
@@ -2661,7 +2655,7 @@
                         <pic:spPr bwMode="auto">
                           <a:xfrm>
                             <a:off x="0" y="0"/>
-                            <a:ext cx="2952750" cy="2209800"/>
+                            <a:ext cx="3019425" cy="2266950"/>
                           </a:xfrm>
                           <a:prstGeom prst="rect">
                             <a:avLst/>
@@ -2677,7 +2671,7 @@
         </w:tc>
         <w:tc>
           <w:tcPr>
-            <w:tcW w:type="dxa" w:w="4819"/>
+            <w:tcW w:type="dxa" w:w="4932"/>
             <w:tcBorders>
               <w:top w:val="none" w:color="FFFFFF" w:sz="0"/>
               <w:left w:val="none" w:color="FFFFFF" w:sz="0"/>
@@ -2699,7 +2693,7 @@
             <w:r>
               <w:drawing>
                 <wp:inline distT="0" distB="0" distL="0" distR="0">
-                  <wp:extent cx="2952750" cy="2209800"/>
+                  <wp:extent cx="3019425" cy="2266950"/>
                   <wp:effectExtent t="0" r="0" b="0" l="0"/>
                   <wp:docPr id="1" name="" descr="" title=""/>
                   <wp:cNvGraphicFramePr>
@@ -2724,7 +2718,7 @@
                         <pic:spPr bwMode="auto">
                           <a:xfrm>
                             <a:off x="0" y="0"/>
-                            <a:ext cx="2952750" cy="2209800"/>
+                            <a:ext cx="3019425" cy="2266950"/>
                           </a:xfrm>
                           <a:prstGeom prst="rect">
                             <a:avLst/>
@@ -2741,11 +2735,12 @@
       </w:tr>
       <w:tr>
         <w:trPr>
-          <w:trHeight w:val="4650" w:hRule="exact"/>
+          <w:cantSplit/>
+          <w:trHeight w:val="4465" w:hRule="exact"/>
         </w:trPr>
         <w:tc>
           <w:tcPr>
-            <w:tcW w:type="dxa" w:w="4819"/>
+            <w:tcW w:type="dxa" w:w="4932"/>
             <w:tcBorders>
               <w:top w:val="none" w:color="FFFFFF" w:sz="0"/>
               <w:left w:val="none" w:color="FFFFFF" w:sz="0"/>
@@ -2767,7 +2762,7 @@
             <w:r>
               <w:drawing>
                 <wp:inline distT="0" distB="0" distL="0" distR="0">
-                  <wp:extent cx="2952750" cy="2209800"/>
+                  <wp:extent cx="3019425" cy="2266950"/>
                   <wp:effectExtent t="0" r="0" b="0" l="0"/>
                   <wp:docPr id="1" name="" descr="" title=""/>
                   <wp:cNvGraphicFramePr>
@@ -2792,7 +2787,7 @@
                         <pic:spPr bwMode="auto">
                           <a:xfrm>
                             <a:off x="0" y="0"/>
-                            <a:ext cx="2952750" cy="2209800"/>
+                            <a:ext cx="3019425" cy="2266950"/>
                           </a:xfrm>
                           <a:prstGeom prst="rect">
                             <a:avLst/>
@@ -2808,7 +2803,7 @@
         </w:tc>
         <w:tc>
           <w:tcPr>
-            <w:tcW w:type="dxa" w:w="4819"/>
+            <w:tcW w:type="dxa" w:w="4932"/>
             <w:tcBorders>
               <w:top w:val="none" w:color="FFFFFF" w:sz="0"/>
               <w:left w:val="none" w:color="FFFFFF" w:sz="0"/>
@@ -2839,7 +2834,7 @@
     </w:tbl>
     <w:sectPr>
       <w:pgSz w:w="11906" w:h="16838" w:orient="portrait"/>
-      <w:pgMar w:top="1134" w:right="1134" w:bottom="1134" w:left="1134" w:header="708" w:footer="708" w:gutter="0"/>
+      <w:pgMar w:top="1021" w:right="1021" w:bottom="1021" w:left="1021" w:header="708" w:footer="708" w:gutter="0"/>
       <w:pgNumType/>
       <w:docGrid w:linePitch="360"/>
     </w:sectPr>

</xml_diff>